<commit_message>
Console access for Tutorial-6.03; config backups done
Tutorial-6.03 (and switch-200V-8 for system-max) will be done over a
console cable on site rather than remotely. Running-config backups of
each switch were taken via SmartZone, so that prerequisite is complete.

Co-Authored-By: Claude Opus 5.5 <noreply@anthropic.com>
Claude-Session: https://claude.ai/code/session_01BZ7jJsE6GWKm6ehHY39VNr
</commit_message>
<xml_diff>
--- a/Trinity 200V VLAN Migration.docx
+++ b/Trinity 200V VLAN Migration.docx
@@ -602,7 +602,7 @@
                 <w:sz w:val="20"/>
                 <w:szCs w:val="20"/>
               </w:rPr>
-              <w:t xml:space="preserve">Only once remote access is restored</w:t>
+              <w:t xml:space="preserve">Done over a console cable on site</w:t>
             </w:r>
           </w:p>
         </w:tc>
@@ -1510,7 +1510,7 @@
     </w:p>
     <w:p>
       <w:r>
-        <w:t xml:space="preserve">The change will be implemented by Alam Singh (Dycom) over SSH to each switch, using the prepared configuration file 200V-cutover-vlan-migration-ICX.txt. That file has pre-check, change, port bounce, verification and rollback blocks for each switch, and its change and rollback blocks have been checked against each switch's current configuration. The port bounce disables and re-enables each port so DHCP devices request a new address; it does not remove PoE. The switches are done one at a time: LT2-1 first, then lv3, lv4 and lv6, then Tutorial-6.03. 14 devices had their port taken from the 200V MAC table rather than the master list (marked * in Appendix A); these are checked in the pre-check.</w:t>
+        <w:t xml:space="preserve">The change will be implemented by Alam Singh (Dycom) over SSH to each switch, and over a console cable on site for switch-200V-Tutorial-6.03, which has no remote access, using the prepared configuration file 200V-cutover-vlan-migration-ICX.txt. That file has pre-check, change, port bounce, verification and rollback blocks for each switch, and its change and rollback blocks have been checked against each switch's current configuration. The port bounce disables and re-enables each port so DHCP devices request a new address; it does not remove PoE. The switches are done one at a time: LT2-1 first, then lv3, lv4 and lv6, then Tutorial-6.03. 14 devices had their port taken from the 200V MAC table rather than the master list (marked * in Appendix A); these are checked in the pre-check.</w:t>
       </w:r>
     </w:p>
     <w:p>
@@ -1729,7 +1729,7 @@
                 <w:sz w:val="20"/>
                 <w:szCs w:val="20"/>
               </w:rPr>
-              <w:t xml:space="preserve">Running-config backup of each switch taken and stored off the switch</w:t>
+              <w:t xml:space="preserve">Running-config backup of each switch taken (via SmartZone, 6 October 2026)</w:t>
             </w:r>
           </w:p>
         </w:tc>
@@ -1746,7 +1746,7 @@
                 <w:sz w:val="20"/>
                 <w:szCs w:val="20"/>
               </w:rPr>
-              <w:t xml:space="preserve">Pending</w:t>
+              <w:t xml:space="preserve">Complete</w:t>
             </w:r>
           </w:p>
         </w:tc>
@@ -1807,7 +1807,7 @@
                 <w:sz w:val="20"/>
                 <w:szCs w:val="20"/>
               </w:rPr>
-              <w:t xml:space="preserve">Remote access to switch-200V-Tutorial-6.03 restored</w:t>
+              <w:t xml:space="preserve">Console cable and on-site access arranged for switch-200V-Tutorial-6.03</w:t>
             </w:r>
           </w:p>
         </w:tc>

</xml_diff>

<commit_message>
Remove mentions of the LT2-1 trunk VLAN tagging
Drops the prerequisite row from the change document and the 6 Oct
tagging notes from the Switches and Ports without device tabs.

Co-Authored-By: Claude Opus 5.5 <noreply@anthropic.com>
Claude-Session: https://claude.ai/code/session_01BZ7jJsE6GWKm6ehHY39VNr
</commit_message>
<xml_diff>
--- a/Trinity 200V VLAN Migration.docx
+++ b/Trinity 200V VLAN Migration.docx
@@ -1613,45 +1613,6 @@
                 <w:szCs w:val="20"/>
               </w:rPr>
               <w:t xml:space="preserve">VLANs 2010, 2510, 2600, 2700 and 2800 exist on each switch and are tagged on its uplink to the core</w:t>
-            </w:r>
-          </w:p>
-        </w:tc>
-        <w:tc>
-          <w:tcPr>
-            <w:tcW w:w="2000" w:type="dxa"/>
-          </w:tcPr>
-          <w:p>
-            <w:pPr>
-              <w:spacing w:after="0" w:line="240" w:lineRule="auto"/>
-            </w:pPr>
-            <w:r>
-              <w:rPr>
-                <w:sz w:val="20"/>
-                <w:szCs w:val="20"/>
-              </w:rPr>
-              <w:t xml:space="preserve">Complete</w:t>
-            </w:r>
-          </w:p>
-        </w:tc>
-      </w:tr>
-      <w:tr>
-        <w:trPr>
-          <w:cantSplit/>
-        </w:trPr>
-        <w:tc>
-          <w:tcPr>
-            <w:tcW w:w="7026" w:type="dxa"/>
-          </w:tcPr>
-          <w:p>
-            <w:pPr>
-              <w:spacing w:after="0" w:line="240" w:lineRule="auto"/>
-            </w:pPr>
-            <w:r>
-              <w:rPr>
-                <w:sz w:val="20"/>
-                <w:szCs w:val="20"/>
-              </w:rPr>
-              <w:t xml:space="preserve">New VLANs tagged on LT2-1 1/1/23 and 1/1/24 (trunks to LT2-2 and LT2-3)</w:t>
             </w:r>
           </w:p>
         </w:tc>

</xml_diff>

<commit_message>
Schedule: switch changes Friday 9 Oct from 6 pm
Outage window Friday 9 Oct 6 pm to Sunday 11 Oct 5 pm. All switch
changes (system-max and reloads, then the VLAN cutover) are made on
Friday evening so other teams can start on Saturday morning.

Co-Authored-By: Claude Opus 5.5 <noreply@anthropic.com>
Claude-Session: https://claude.ai/code/session_01BZ7jJsE6GWKm6ehHY39VNr
</commit_message>
<xml_diff>
--- a/Trinity 200V VLAN Migration.docx
+++ b/Trinity 200V VLAN Migration.docx
@@ -2182,7 +2182,12 @@
     </w:p>
     <w:p>
       <w:r>
-        <w:t xml:space="preserve">To be agreed with Trinity. Each switch can be done in its own window; lv6, with 145 ports, should have a window of its own. The system-max change, which needs a reload of each switch, should be scheduled before the cutover.</w:t>
+        <w:t xml:space="preserve">Outage window: Friday 9 October 2026, 6:00 pm to Sunday 11 October 2026, 5:00 pm.</w:t>
+      </w:r>
+    </w:p>
+    <w:p>
+      <w:r>
+        <w:t xml:space="preserve">All switch changes are made on Friday 9 October 2026 from 6:00 pm, so the other teams can start their work on Saturday morning. The system-max change and reload of each switch are done first, then the VLAN cutover on each switch in the order above.</w:t>
       </w:r>
     </w:p>
     <w:p>

</xml_diff>

<commit_message>
Add VLAN 2900 to 200V AP ports for the new SSIDs
The 200V APs move to the new SSIDs in SmartZone in the same window.
Trinity Visitor and eduroam use VLAN 2900, which is not tagged on the
AP ports, so the cutover config now tags 2900 on the 40 AP ports (lv3,
lv4, lv6, LT2-1). The change document covers it in scope, impact,
testing, risks, rollback and scheduling.

Co-Authored-By: Claude Opus 5.5 <noreply@anthropic.com>
Claude-Session: https://claude.ai/code/session_01BZ7jJsE6GWKm6ehHY39VNr
</commit_message>
<xml_diff>
--- a/Trinity 200V VLAN Migration.docx
+++ b/Trinity 200V VLAN Migration.docx
@@ -1383,7 +1383,25 @@
     </w:p>
     <w:p>
       <w:r>
-        <w:t xml:space="preserve">Only untagged VLAN membership on the listed ports changes. Tagged VLANs on AP and other trunk ports are not changed. The full device list is in Appendix A. Device addressing, DHCP, DNS, firewall rules and any device-side changes are outside the scope of this change. switch-200V-8, LT2-2 and LT2-3 have no listed devices and are not changed. Ports with no listed device, and devices not found on any switch, are tracked on the Review tab of 200V Device Port List.xlsx and are not part of this change.</w:t>
+        <w:t xml:space="preserve">Only untagged VLAN membership on the listed ports changes. Tagged VLANs on AP and other trunk ports are not changed, apart from adding VLAN 2900 to the AP ports (see Wi-Fi below). The full device list is in Appendix A. Device addressing, DHCP, DNS, firewall rules and any device-side changes are outside the scope of this change. switch-200V-8, LT2-2 and LT2-3 have no listed devices and are not changed. Ports with no listed device, and devices not found on any switch, are tracked on the Review tab of 200V Device Port List.xlsx and are not part of this change.</w:t>
+      </w:r>
+    </w:p>
+    <w:p>
+      <w:pPr>
+        <w:keepNext/>
+        <w:spacing w:before="240" w:after="120"/>
+      </w:pPr>
+      <w:r>
+        <w:rPr>
+          <w:b/>
+          <w:bCs/>
+        </w:rPr>
+        <w:t xml:space="preserve">Wi-Fi</w:t>
+      </w:r>
+    </w:p>
+    <w:p>
+      <w:r>
+        <w:t xml:space="preserve">The 200V APs are moved to the new SSIDs in SmartZone in the same window. Trinity Wireless uses VLAN 2300, which is already tagged on the AP ports. Trinity Visitor and eduroam use VLAN 2900, which is not, so VLAN 2900 is added as a tagged VLAN on the 40 AP ports (lv3 1/1/1 to 1/1/11, lv4 1/1/1 to 1/1/11, lv6 1/1/13 to 1/1/29 and LT2-1 1/1/1) before the WLAN changeover. This only adds tagging and has no impact on the APs or their current SSIDs.</w:t>
       </w:r>
     </w:p>
     <w:p>
@@ -1423,6 +1441,19 @@
       </w:pPr>
       <w:r>
         <w:t xml:space="preserve">37 APs and their Wi-Fi clients drop while the AP ports are moved</w:t>
+      </w:r>
+    </w:p>
+    <w:p>
+      <w:pPr>
+        <w:pStyle w:val="ListParagraph"/>
+        <w:numPr>
+          <w:ilvl w:val="0"/>
+          <w:numId w:val="1"/>
+        </w:numPr>
+        <w:spacing w:after="60"/>
+      </w:pPr>
+      <w:r>
+        <w:t xml:space="preserve">Wi-Fi users at 200V reconnect to the new SSIDs when the WLANs are changed over in SmartZone</w:t>
       </w:r>
     </w:p>
     <w:p>
@@ -1894,7 +1925,7 @@
     </w:p>
     <w:p>
       <w:r>
-        <w:t xml:space="preserve">Each switch is rolled back with its ROLLBACK block from the configuration file, which puts each port back on its old VLAN. A single failed device doesn't need a whole-switch rollback: only that port's lines are used.</w:t>
+        <w:t xml:space="preserve">Each switch is rolled back with its ROLLBACK block from the configuration file, which puts each port back on its old VLAN. A single failed device doesn't need a whole-switch rollback: only that port's lines are used. The VLAN 2900 tagging on the AP ports can stay in place if the WLAN changeover is rolled back; it has no effect until an SSID uses it.</w:t>
       </w:r>
     </w:p>
     <w:p>
@@ -2068,7 +2099,7 @@
         <w:spacing w:after="60"/>
       </w:pPr>
       <w:r>
-        <w:t xml:space="preserve">AP and other trunk ports still carry the same tagged VLANs as before</w:t>
+        <w:t xml:space="preserve">AP and other trunk ports still carry the same tagged VLANs as before, plus VLAN 2900 on the AP ports</w:t>
       </w:r>
     </w:p>
     <w:p>
@@ -2086,7 +2117,12 @@
     </w:p>
     <w:p>
       <w:r>
-        <w:t xml:space="preserve">The change is complete when every device in Appendix A passes and write memory has been run on all five switches.</w:t>
+        <w:t xml:space="preserve">For Wi-Fi, after the WLAN changeover a test client on each new SSID gets an address on that SSID's subnet: Trinity Wireless on 10.21.8.0/21 (VLAN 2300), Trinity Visitor and eduroam on 10.21.29.0/24 (VLAN 2900).</w:t>
+      </w:r>
+    </w:p>
+    <w:p>
+      <w:r>
+        <w:t xml:space="preserve">The change is complete when every device in Appendix A passes, the Wi-Fi test passes, and write memory has been run on all five switches.</w:t>
       </w:r>
     </w:p>
     <w:p>
@@ -2164,6 +2200,19 @@
         <w:spacing w:after="60"/>
       </w:pPr>
       <w:r>
+        <w:t xml:space="preserve">If VLAN 2900 is missing on an AP port, then Trinity Visitor and eduroam clients on that AP get no address. This has low likelihood because VLAN 2900 is added to all 40 AP ports and checked with show vlan 2900 before the WLAN changeover. If this risk occurs, VLAN 2900 is tagged on that port.</w:t>
+      </w:r>
+    </w:p>
+    <w:p>
+      <w:pPr>
+        <w:pStyle w:val="ListParagraph"/>
+        <w:numPr>
+          <w:ilvl w:val="0"/>
+          <w:numId w:val="5"/>
+        </w:numPr>
+        <w:spacing w:after="60"/>
+      </w:pPr>
+      <w:r>
         <w:t xml:space="preserve">If a paste into the switch is cut short, then some ports are not moved. This has low likelihood because consecutive ports are grouped into ranges, which keeps each block short, and every port is checked in the verify step. If this risk occurs, the missing lines are pasted again.</w:t>
       </w:r>
     </w:p>
@@ -2187,7 +2236,7 @@
     </w:p>
     <w:p>
       <w:r>
-        <w:t xml:space="preserve">All switch changes are made on Friday 9 October 2026 from 6:00 pm, so the other teams can start their work on Saturday morning. The system-max change and reload of each switch are done first, then the VLAN cutover on each switch in the order above.</w:t>
+        <w:t xml:space="preserve">All switch changes are made on Friday 9 October 2026 from 6:00 pm, so the other teams can start their work on Saturday morning. The system-max change and reload of each switch are done first, then the VLAN cutover on each switch in the order above. The SmartZone WLAN changeover for the 200V APs follows the switch changes in the same window.</w:t>
       </w:r>
     </w:p>
     <w:p>

</xml_diff>

<commit_message>
Change document: 200v WLAN group changes for the Wi-Fi changeover
Keep Trinity NetSegPilot, remove the four existing WLANs, add Trinity
Wireless v2300, eduroam v2900 and Trinity Visitor v2900. Adds the
matching impact, prerequisite, rollback and test steps.

Co-Authored-By: Claude Opus 5.5 <noreply@anthropic.com>
Claude-Session: https://claude.ai/code/session_01BZ7jJsE6GWKm6ehHY39VNr
</commit_message>
<xml_diff>
--- a/Trinity 200V VLAN Migration.docx
+++ b/Trinity 200V VLAN Migration.docx
@@ -1401,7 +1401,399 @@
     </w:p>
     <w:p>
       <w:r>
-        <w:t xml:space="preserve">The 200V APs are moved to the new SSIDs in SmartZone in the same window. Trinity Wireless uses VLAN 2300, which is already tagged on the AP ports. Trinity Visitor and eduroam use VLAN 2900, which is not, so VLAN 2900 is added as a tagged VLAN on the 40 AP ports (lv3 1/1/1 to 1/1/11, lv4 1/1/1 to 1/1/11, lv6 1/1/13 to 1/1/29 and LT2-1 1/1/1) before the WLAN changeover. This only adds tagging and has no impact on the APs or their current SSIDs.</w:t>
+        <w:t xml:space="preserve">The 200V APs are moved to the new SSIDs by changing the 200v WLAN group in SmartZone, in the same window after the switch changes. Trinity NetSegPilot is kept, the four existing WLANs are removed, and the three new WLANs are added:</w:t>
+      </w:r>
+    </w:p>
+    <w:tbl>
+      <w:tblPr>
+        <w:tblW w:w="9026" w:type="dxa"/>
+        <w:tblBorders>
+          <w:top w:val="single" w:sz="4" w:space="0" w:color="A6A6A6"/>
+          <w:left w:val="single" w:sz="4" w:space="0" w:color="A6A6A6"/>
+          <w:bottom w:val="single" w:sz="4" w:space="0" w:color="A6A6A6"/>
+          <w:right w:val="single" w:sz="4" w:space="0" w:color="A6A6A6"/>
+          <w:insideH w:val="single" w:sz="4" w:space="0" w:color="A6A6A6"/>
+          <w:insideV w:val="single" w:sz="4" w:space="0" w:color="A6A6A6"/>
+        </w:tblBorders>
+        <w:tblLayout w:type="fixed"/>
+        <w:tblCellMar>
+          <w:top w:w="40" w:type="dxa"/>
+          <w:left w:w="80" w:type="dxa"/>
+          <w:bottom w:w="40" w:type="dxa"/>
+          <w:right w:w="80" w:type="dxa"/>
+        </w:tblCellMar>
+      </w:tblPr>
+      <w:tblGrid>
+        <w:gridCol w:w="7026"/>
+        <w:gridCol w:w="2000"/>
+      </w:tblGrid>
+      <w:tr>
+        <w:trPr>
+          <w:cantSplit/>
+          <w:tblHeader/>
+        </w:trPr>
+        <w:tc>
+          <w:tcPr>
+            <w:tcW w:w="7026" w:type="dxa"/>
+            <w:shd w:val="clear" w:color="auto" w:fill="D9D9D9"/>
+          </w:tcPr>
+          <w:p>
+            <w:pPr>
+              <w:spacing w:after="0" w:line="240" w:lineRule="auto"/>
+            </w:pPr>
+            <w:r>
+              <w:rPr>
+                <w:b/>
+                <w:bCs/>
+                <w:sz w:val="20"/>
+                <w:szCs w:val="20"/>
+              </w:rPr>
+              <w:t xml:space="preserve">WLAN in the 200v WLAN group (SSID, VLAN)</w:t>
+            </w:r>
+          </w:p>
+        </w:tc>
+        <w:tc>
+          <w:tcPr>
+            <w:tcW w:w="2000" w:type="dxa"/>
+            <w:shd w:val="clear" w:color="auto" w:fill="D9D9D9"/>
+          </w:tcPr>
+          <w:p>
+            <w:pPr>
+              <w:spacing w:after="0" w:line="240" w:lineRule="auto"/>
+            </w:pPr>
+            <w:r>
+              <w:rPr>
+                <w:b/>
+                <w:bCs/>
+                <w:sz w:val="20"/>
+                <w:szCs w:val="20"/>
+              </w:rPr>
+              <w:t xml:space="preserve">Change</w:t>
+            </w:r>
+          </w:p>
+        </w:tc>
+      </w:tr>
+      <w:tr>
+        <w:trPr>
+          <w:cantSplit/>
+        </w:trPr>
+        <w:tc>
+          <w:tcPr>
+            <w:tcW w:w="7026" w:type="dxa"/>
+          </w:tcPr>
+          <w:p>
+            <w:pPr>
+              <w:spacing w:after="0" w:line="240" w:lineRule="auto"/>
+            </w:pPr>
+            <w:r>
+              <w:rPr>
+                <w:sz w:val="20"/>
+                <w:szCs w:val="20"/>
+              </w:rPr>
+              <w:t xml:space="preserve">Trinity NetSegPilot (Trinity NetSegPilot, 2300)</w:t>
+            </w:r>
+          </w:p>
+        </w:tc>
+        <w:tc>
+          <w:tcPr>
+            <w:tcW w:w="2000" w:type="dxa"/>
+          </w:tcPr>
+          <w:p>
+            <w:pPr>
+              <w:spacing w:after="0" w:line="240" w:lineRule="auto"/>
+            </w:pPr>
+            <w:r>
+              <w:rPr>
+                <w:sz w:val="20"/>
+                <w:szCs w:val="20"/>
+              </w:rPr>
+              <w:t xml:space="preserve">Keep</w:t>
+            </w:r>
+          </w:p>
+        </w:tc>
+      </w:tr>
+      <w:tr>
+        <w:trPr>
+          <w:cantSplit/>
+        </w:trPr>
+        <w:tc>
+          <w:tcPr>
+            <w:tcW w:w="7026" w:type="dxa"/>
+          </w:tcPr>
+          <w:p>
+            <w:pPr>
+              <w:spacing w:after="0" w:line="240" w:lineRule="auto"/>
+            </w:pPr>
+            <w:r>
+              <w:rPr>
+                <w:sz w:val="20"/>
+                <w:szCs w:val="20"/>
+              </w:rPr>
+              <w:t xml:space="preserve">Trinity Staff (Trinity Staff)</w:t>
+            </w:r>
+          </w:p>
+        </w:tc>
+        <w:tc>
+          <w:tcPr>
+            <w:tcW w:w="2000" w:type="dxa"/>
+          </w:tcPr>
+          <w:p>
+            <w:pPr>
+              <w:spacing w:after="0" w:line="240" w:lineRule="auto"/>
+            </w:pPr>
+            <w:r>
+              <w:rPr>
+                <w:sz w:val="20"/>
+                <w:szCs w:val="20"/>
+              </w:rPr>
+              <w:t xml:space="preserve">Remove</w:t>
+            </w:r>
+          </w:p>
+        </w:tc>
+      </w:tr>
+      <w:tr>
+        <w:trPr>
+          <w:cantSplit/>
+        </w:trPr>
+        <w:tc>
+          <w:tcPr>
+            <w:tcW w:w="7026" w:type="dxa"/>
+          </w:tcPr>
+          <w:p>
+            <w:pPr>
+              <w:spacing w:after="0" w:line="240" w:lineRule="auto"/>
+            </w:pPr>
+            <w:r>
+              <w:rPr>
+                <w:sz w:val="20"/>
+                <w:szCs w:val="20"/>
+              </w:rPr>
+              <w:t xml:space="preserve">Trinity Visitor (Trinity Visitor)</w:t>
+            </w:r>
+          </w:p>
+        </w:tc>
+        <w:tc>
+          <w:tcPr>
+            <w:tcW w:w="2000" w:type="dxa"/>
+          </w:tcPr>
+          <w:p>
+            <w:pPr>
+              <w:spacing w:after="0" w:line="240" w:lineRule="auto"/>
+            </w:pPr>
+            <w:r>
+              <w:rPr>
+                <w:sz w:val="20"/>
+                <w:szCs w:val="20"/>
+              </w:rPr>
+              <w:t xml:space="preserve">Remove</w:t>
+            </w:r>
+          </w:p>
+        </w:tc>
+      </w:tr>
+      <w:tr>
+        <w:trPr>
+          <w:cantSplit/>
+        </w:trPr>
+        <w:tc>
+          <w:tcPr>
+            <w:tcW w:w="7026" w:type="dxa"/>
+          </w:tcPr>
+          <w:p>
+            <w:pPr>
+              <w:spacing w:after="0" w:line="240" w:lineRule="auto"/>
+            </w:pPr>
+            <w:r>
+              <w:rPr>
+                <w:sz w:val="20"/>
+                <w:szCs w:val="20"/>
+              </w:rPr>
+              <w:t xml:space="preserve">Trinity Wireless - 802.11R (Trinity Wireless)</w:t>
+            </w:r>
+          </w:p>
+        </w:tc>
+        <w:tc>
+          <w:tcPr>
+            <w:tcW w:w="2000" w:type="dxa"/>
+          </w:tcPr>
+          <w:p>
+            <w:pPr>
+              <w:spacing w:after="0" w:line="240" w:lineRule="auto"/>
+            </w:pPr>
+            <w:r>
+              <w:rPr>
+                <w:sz w:val="20"/>
+                <w:szCs w:val="20"/>
+              </w:rPr>
+              <w:t xml:space="preserve">Remove</w:t>
+            </w:r>
+          </w:p>
+        </w:tc>
+      </w:tr>
+      <w:tr>
+        <w:trPr>
+          <w:cantSplit/>
+        </w:trPr>
+        <w:tc>
+          <w:tcPr>
+            <w:tcW w:w="7026" w:type="dxa"/>
+          </w:tcPr>
+          <w:p>
+            <w:pPr>
+              <w:spacing w:after="0" w:line="240" w:lineRule="auto"/>
+            </w:pPr>
+            <w:r>
+              <w:rPr>
+                <w:sz w:val="20"/>
+                <w:szCs w:val="20"/>
+              </w:rPr>
+              <w:t xml:space="preserve">eduroam 2026 (eduroam)</w:t>
+            </w:r>
+          </w:p>
+        </w:tc>
+        <w:tc>
+          <w:tcPr>
+            <w:tcW w:w="2000" w:type="dxa"/>
+          </w:tcPr>
+          <w:p>
+            <w:pPr>
+              <w:spacing w:after="0" w:line="240" w:lineRule="auto"/>
+            </w:pPr>
+            <w:r>
+              <w:rPr>
+                <w:sz w:val="20"/>
+                <w:szCs w:val="20"/>
+              </w:rPr>
+              <w:t xml:space="preserve">Remove</w:t>
+            </w:r>
+          </w:p>
+        </w:tc>
+      </w:tr>
+      <w:tr>
+        <w:trPr>
+          <w:cantSplit/>
+        </w:trPr>
+        <w:tc>
+          <w:tcPr>
+            <w:tcW w:w="7026" w:type="dxa"/>
+          </w:tcPr>
+          <w:p>
+            <w:pPr>
+              <w:spacing w:after="0" w:line="240" w:lineRule="auto"/>
+            </w:pPr>
+            <w:r>
+              <w:rPr>
+                <w:sz w:val="20"/>
+                <w:szCs w:val="20"/>
+              </w:rPr>
+              <w:t xml:space="preserve">Trinity Wireless v2300 (Trinity Wireless, 2300)</w:t>
+            </w:r>
+          </w:p>
+        </w:tc>
+        <w:tc>
+          <w:tcPr>
+            <w:tcW w:w="2000" w:type="dxa"/>
+          </w:tcPr>
+          <w:p>
+            <w:pPr>
+              <w:spacing w:after="0" w:line="240" w:lineRule="auto"/>
+            </w:pPr>
+            <w:r>
+              <w:rPr>
+                <w:sz w:val="20"/>
+                <w:szCs w:val="20"/>
+              </w:rPr>
+              <w:t xml:space="preserve">Add</w:t>
+            </w:r>
+          </w:p>
+        </w:tc>
+      </w:tr>
+      <w:tr>
+        <w:trPr>
+          <w:cantSplit/>
+        </w:trPr>
+        <w:tc>
+          <w:tcPr>
+            <w:tcW w:w="7026" w:type="dxa"/>
+          </w:tcPr>
+          <w:p>
+            <w:pPr>
+              <w:spacing w:after="0" w:line="240" w:lineRule="auto"/>
+            </w:pPr>
+            <w:r>
+              <w:rPr>
+                <w:sz w:val="20"/>
+                <w:szCs w:val="20"/>
+              </w:rPr>
+              <w:t xml:space="preserve">eduroam v2900 (eduroam, 2900)</w:t>
+            </w:r>
+          </w:p>
+        </w:tc>
+        <w:tc>
+          <w:tcPr>
+            <w:tcW w:w="2000" w:type="dxa"/>
+          </w:tcPr>
+          <w:p>
+            <w:pPr>
+              <w:spacing w:after="0" w:line="240" w:lineRule="auto"/>
+            </w:pPr>
+            <w:r>
+              <w:rPr>
+                <w:sz w:val="20"/>
+                <w:szCs w:val="20"/>
+              </w:rPr>
+              <w:t xml:space="preserve">Add</w:t>
+            </w:r>
+          </w:p>
+        </w:tc>
+      </w:tr>
+      <w:tr>
+        <w:trPr>
+          <w:cantSplit/>
+        </w:trPr>
+        <w:tc>
+          <w:tcPr>
+            <w:tcW w:w="7026" w:type="dxa"/>
+          </w:tcPr>
+          <w:p>
+            <w:pPr>
+              <w:spacing w:after="0" w:line="240" w:lineRule="auto"/>
+            </w:pPr>
+            <w:r>
+              <w:rPr>
+                <w:sz w:val="20"/>
+                <w:szCs w:val="20"/>
+              </w:rPr>
+              <w:t xml:space="preserve">Trinity Visitor v2900 (Trinity Visitor, 2900)</w:t>
+            </w:r>
+          </w:p>
+        </w:tc>
+        <w:tc>
+          <w:tcPr>
+            <w:tcW w:w="2000" w:type="dxa"/>
+          </w:tcPr>
+          <w:p>
+            <w:pPr>
+              <w:spacing w:after="0" w:line="240" w:lineRule="auto"/>
+            </w:pPr>
+            <w:r>
+              <w:rPr>
+                <w:sz w:val="20"/>
+                <w:szCs w:val="20"/>
+              </w:rPr>
+              <w:t xml:space="preserve">Add</w:t>
+            </w:r>
+          </w:p>
+        </w:tc>
+      </w:tr>
+    </w:tbl>
+    <w:p>
+      <w:pPr>
+        <w:spacing w:after="80"/>
+      </w:pPr>
+    </w:p>
+    <w:p>
+      <w:r>
+        <w:t xml:space="preserve">VLAN 2300 is already tagged on the AP ports, and Trinity NetSegPilot already carries traffic on it. VLAN 2900 is not, so it is added as a tagged VLAN on the 40 AP ports (lv3 1/1/1 to 1/1/11, lv4 1/1/1 to 1/1/11, lv6 1/1/13 to 1/1/29 and LT2-1 1/1/1) as part of the switch changes, before the WLAN group is changed. This only adds tagging and has no impact on the APs or their current SSIDs.</w:t>
       </w:r>
     </w:p>
     <w:p>
@@ -1453,7 +1845,7 @@
         <w:spacing w:after="60"/>
       </w:pPr>
       <w:r>
-        <w:t xml:space="preserve">Wi-Fi users at 200V reconnect to the new SSIDs when the WLANs are changed over in SmartZone</w:t>
+        <w:t xml:space="preserve">Wi-Fi users at 200V drop and reconnect when the 200v WLAN group is changed; the Trinity Staff SSID is removed from the 200V APs (no clients on 6 October 2026)</w:t>
       </w:r>
     </w:p>
     <w:p>
@@ -1760,6 +2152,45 @@
                 <w:sz w:val="20"/>
                 <w:szCs w:val="20"/>
               </w:rPr>
+              <w:t xml:space="preserve">Current 200v WLAN group recorded (WLANs and any VLAN overrides) for rollback</w:t>
+            </w:r>
+          </w:p>
+        </w:tc>
+        <w:tc>
+          <w:tcPr>
+            <w:tcW w:w="2000" w:type="dxa"/>
+          </w:tcPr>
+          <w:p>
+            <w:pPr>
+              <w:spacing w:after="0" w:line="240" w:lineRule="auto"/>
+            </w:pPr>
+            <w:r>
+              <w:rPr>
+                <w:sz w:val="20"/>
+                <w:szCs w:val="20"/>
+              </w:rPr>
+              <w:t xml:space="preserve">Pending</w:t>
+            </w:r>
+          </w:p>
+        </w:tc>
+      </w:tr>
+      <w:tr>
+        <w:trPr>
+          <w:cantSplit/>
+        </w:trPr>
+        <w:tc>
+          <w:tcPr>
+            <w:tcW w:w="7026" w:type="dxa"/>
+          </w:tcPr>
+          <w:p>
+            <w:pPr>
+              <w:spacing w:after="0" w:line="240" w:lineRule="auto"/>
+            </w:pPr>
+            <w:r>
+              <w:rPr>
+                <w:sz w:val="20"/>
+                <w:szCs w:val="20"/>
+              </w:rPr>
               <w:t xml:space="preserve">Review tab items decided (ports filled in from the MAC table, devices not found, unlisted devices)</w:t>
             </w:r>
           </w:p>
@@ -1925,7 +2356,12 @@
     </w:p>
     <w:p>
       <w:r>
-        <w:t xml:space="preserve">Each switch is rolled back with its ROLLBACK block from the configuration file, which puts each port back on its old VLAN. A single failed device doesn't need a whole-switch rollback: only that port's lines are used. The VLAN 2900 tagging on the AP ports can stay in place if the WLAN changeover is rolled back; it has no effect until an SSID uses it.</w:t>
+        <w:t xml:space="preserve">Each switch is rolled back with its ROLLBACK block from the configuration file, which puts each port back on its old VLAN. A single failed device doesn't need a whole-switch rollback: only that port's lines are used.</w:t>
+      </w:r>
+    </w:p>
+    <w:p>
+      <w:r>
+        <w:t xml:space="preserve">The Wi-Fi change is rolled back in SmartZone by removing the three new WLANs from the 200v WLAN group and adding the four removed WLANs back with their recorded settings. The VLAN 2900 tagging on the AP ports can stay in place; it has no effect until an SSID uses it.</w:t>
       </w:r>
     </w:p>
     <w:p>
@@ -2117,7 +2553,7 @@
     </w:p>
     <w:p>
       <w:r>
-        <w:t xml:space="preserve">For Wi-Fi, after the WLAN changeover a test client on each new SSID gets an address on that SSID's subnet: Trinity Wireless on 10.21.8.0/21 (VLAN 2300), Trinity Visitor and eduroam on 10.21.29.0/24 (VLAN 2900).</w:t>
+        <w:t xml:space="preserve">For Wi-Fi, after the WLAN group change a test client on each SSID connects and gets an address on its subnet: Trinity Wireless and Trinity NetSegPilot on 10.21.8.0/21 (VLAN 2300), Trinity Visitor and eduroam on 10.21.29.0/24 (VLAN 2900).</w:t>
       </w:r>
     </w:p>
     <w:p>
@@ -2236,7 +2672,7 @@
     </w:p>
     <w:p>
       <w:r>
-        <w:t xml:space="preserve">All switch changes are made on Friday 9 October 2026 from 6:00 pm, so the other teams can start their work on Saturday morning. The system-max change and reload of each switch are done first, then the VLAN cutover on each switch in the order above. The SmartZone WLAN changeover for the 200V APs follows the switch changes in the same window.</w:t>
+        <w:t xml:space="preserve">All switch changes are made on Friday 9 October 2026 from 6:00 pm, so the other teams can start their work on Saturday morning. The system-max change and reload of each switch are done first, then the VLAN cutover on each switch in the order above. The 200v WLAN group change in SmartZone follows the switch changes in the same window.</w:t>
       </w:r>
     </w:p>
     <w:p>

</xml_diff>

<commit_message>
Change document: fixes from review
- Room NUC row: all 13 are Room NUCs
- VLAN 1272 named 200V_av, as on the switches
- Prerequisites: add the Wi-Fi VLANs 2300 and 2900, and the new WLANs
  existing in SmartZone
- How Change implemented: mention the system-max change first and the
  VLAN 2900 AP-port block
- Risk 2: lv6 is not the last switch

Co-Authored-By: Claude Opus 5.5 <noreply@anthropic.com>
Claude-Session: https://claude.ai/code/session_01BZ7jJsE6GWKm6ehHY39VNr
</commit_message>
<xml_diff>
--- a/Trinity 200V VLAN Migration.docx
+++ b/Trinity 200V VLAN Migration.docx
@@ -959,7 +959,7 @@
                 <w:sz w:val="20"/>
                 <w:szCs w:val="20"/>
               </w:rPr>
-              <w:t xml:space="preserve">1272 (200V_w_wifi)</w:t>
+              <w:t xml:space="preserve">1272 (200V_av)</w:t>
             </w:r>
           </w:p>
         </w:tc>
@@ -1032,7 +1032,7 @@
                 <w:sz w:val="20"/>
                 <w:szCs w:val="20"/>
               </w:rPr>
-              <w:t xml:space="preserve">AV (Room NUC and others)</w:t>
+              <w:t xml:space="preserve">AV (Room NUC)</w:t>
             </w:r>
           </w:p>
         </w:tc>
@@ -1933,7 +1933,7 @@
     </w:p>
     <w:p>
       <w:r>
-        <w:t xml:space="preserve">The change will be implemented by Alam Singh (Dycom) over SSH to each switch, and over a console cable on site for switch-200V-Tutorial-6.03, which has no remote access, using the prepared configuration file 200V-cutover-vlan-migration-ICX.txt. That file has pre-check, change, port bounce, verification and rollback blocks for each switch, and its change and rollback blocks have been checked against each switch's current configuration. The port bounce disables and re-enables each port so DHCP devices request a new address; it does not remove PoE. The switches are done one at a time: LT2-1 first, then lv3, lv4 and lv6, then Tutorial-6.03. 14 devices had their port taken from the 200V MAC table rather than the master list (marked * in Appendix A); these are checked in the pre-check.</w:t>
+        <w:t xml:space="preserve">The change will be implemented by Alam Singh (Dycom) over SSH to each switch, and over a console cable on site for switch-200V-Tutorial-6.03, which has no remote access, using the prepared configuration file 200V-cutover-vlan-migration-ICX.txt. That file has pre-check, change, port bounce, verification and rollback blocks for each switch, and its change and rollback blocks have been checked against each switch's current configuration. The port bounce disables and re-enables each port so DHCP devices request a new address; it does not remove PoE. On lv3, lv4, lv6 and LT2-1 the file also adds VLAN 2900 to the AP ports (see Wi-Fi). Before the cutover, the system-max change (system-max-spanning-tree-40-ICX.txt) is made and each switch reloaded. The switches are done one at a time: LT2-1 first, then lv3, lv4 and lv6, then Tutorial-6.03. 14 devices had their port taken from the 200V MAC table rather than the master list (marked * in Appendix A); these are checked in the pre-check.</w:t>
       </w:r>
     </w:p>
     <w:p>
@@ -2035,7 +2035,7 @@
                 <w:sz w:val="20"/>
                 <w:szCs w:val="20"/>
               </w:rPr>
-              <w:t xml:space="preserve">VLANs 2010, 2510, 2600, 2700 and 2800 exist on each switch and are tagged on its uplink to the core</w:t>
+              <w:t xml:space="preserve">VLANs 2010, 2300, 2510, 2600, 2700, 2800 and 2900 exist on each switch and are tagged on its uplink to the core</w:t>
             </w:r>
           </w:p>
         </w:tc>
@@ -2131,6 +2131,45 @@
                 <w:szCs w:val="20"/>
               </w:rPr>
               <w:t xml:space="preserve">Complete</w:t>
+            </w:r>
+          </w:p>
+        </w:tc>
+      </w:tr>
+      <w:tr>
+        <w:trPr>
+          <w:cantSplit/>
+        </w:trPr>
+        <w:tc>
+          <w:tcPr>
+            <w:tcW w:w="7026" w:type="dxa"/>
+          </w:tcPr>
+          <w:p>
+            <w:pPr>
+              <w:spacing w:after="0" w:line="240" w:lineRule="auto"/>
+            </w:pPr>
+            <w:r>
+              <w:rPr>
+                <w:sz w:val="20"/>
+                <w:szCs w:val="20"/>
+              </w:rPr>
+              <w:t xml:space="preserve">WLANs Trinity Wireless v2300, eduroam v2900 and Trinity Visitor v2900 exist in SmartZone</w:t>
+            </w:r>
+          </w:p>
+        </w:tc>
+        <w:tc>
+          <w:tcPr>
+            <w:tcW w:w="2000" w:type="dxa"/>
+          </w:tcPr>
+          <w:p>
+            <w:pPr>
+              <w:spacing w:after="0" w:line="240" w:lineRule="auto"/>
+            </w:pPr>
+            <w:r>
+              <w:rPr>
+                <w:sz w:val="20"/>
+                <w:szCs w:val="20"/>
+              </w:rPr>
+              <w:t xml:space="preserve">Pending</w:t>
             </w:r>
           </w:p>
         </w:tc>
@@ -2597,7 +2636,7 @@
         <w:spacing w:after="60"/>
       </w:pPr>
       <w:r>
-        <w:t xml:space="preserve">If lv6 is changed before its spanning-tree limit is raised, then VLANs 2600 and 2700 run without spanning-tree and a patching loop on them would not be blocked. This has low likelihood if the system-max change is done first, as listed in the prerequisites. If it cannot be done first, lv6 is done last and its ports are checked for loops after the change.</w:t>
+        <w:t xml:space="preserve">If lv6 is changed before its spanning-tree limit is raised, then VLANs 2600 and 2700 run without spanning-tree and a patching loop on them would not be blocked. This has low likelihood if the system-max change is done first, as listed in the prerequisites. If it cannot be done first, lv6 is done after the other switches and its ports are checked for loops after the change.</w:t>
       </w:r>
     </w:p>
     <w:p>

</xml_diff>

<commit_message>
Change document: reload impact, WLANs built
- Impact: each switch reloads once for the system-max change; LT2-1
  also drops LT2-2/LT2-3 and the core drops all of 200V
- Rollback: system-max change has its own rollback in its file
- Prerequisite: new WLANs exist in SmartZone (Complete)
- switch-200V-8, LT2-2 and LT2-3 only get the system-max change

Co-Authored-By: Claude Opus 5.5 <noreply@anthropic.com>
Claude-Session: https://claude.ai/code/session_01BZ7jJsE6GWKm6ehHY39VNr
</commit_message>
<xml_diff>
--- a/Trinity 200V VLAN Migration.docx
+++ b/Trinity 200V VLAN Migration.docx
@@ -1383,7 +1383,7 @@
     </w:p>
     <w:p>
       <w:r>
-        <w:t xml:space="preserve">Only untagged VLAN membership on the listed ports changes. Tagged VLANs on AP and other trunk ports are not changed, apart from adding VLAN 2900 to the AP ports (see Wi-Fi below). The full device list is in Appendix A. Device addressing, DHCP, DNS, firewall rules and any device-side changes are outside the scope of this change. switch-200V-8, LT2-2 and LT2-3 have no listed devices and are not changed. Ports with no listed device, and devices not found on any switch, are tracked on the Review tab of 200V Device Port List.xlsx and are not part of this change.</w:t>
+        <w:t xml:space="preserve">Only untagged VLAN membership on the listed ports changes. Tagged VLANs on AP and other trunk ports are not changed, apart from adding VLAN 2900 to the AP ports (see Wi-Fi below). The full device list is in Appendix A. Device addressing, DHCP, DNS, firewall rules and any device-side changes are outside the scope of this change. switch-200V-8, LT2-2 and LT2-3 have no listed devices; their only change is the system-max change. Ports with no listed device, and devices not found on any switch, are tracked on the Review tab of 200V Device Port List.xlsx and are not part of this change.</w:t>
       </w:r>
     </w:p>
     <w:p>
@@ -1807,6 +1807,19 @@
           <w:bCs/>
         </w:rPr>
         <w:t xml:space="preserve">Impact</w:t>
+      </w:r>
+    </w:p>
+    <w:p>
+      <w:pPr>
+        <w:pStyle w:val="ListParagraph"/>
+        <w:numPr>
+          <w:ilvl w:val="0"/>
+          <w:numId w:val="1"/>
+        </w:numPr>
+        <w:spacing w:after="60"/>
+      </w:pPr>
+      <w:r>
+        <w:t xml:space="preserve">Each switch is reloaded once for the system-max change, before the cutover. Everything on a switch is offline for a few minutes while it restarts. Reloading LT2-1 also drops LT2-2 and LT2-3, and reloading trinity200V-core drops all of 200V</w:t>
       </w:r>
     </w:p>
     <w:p>
@@ -1897,7 +1910,7 @@
         <w:spacing w:after="60"/>
       </w:pPr>
       <w:r>
-        <w:t xml:space="preserve">No other ports, VLANs or services on the five switches are changed</w:t>
+        <w:t xml:space="preserve">No other ports, VLANs or services are changed</w:t>
       </w:r>
     </w:p>
     <w:p>
@@ -1915,7 +1928,7 @@
     </w:p>
     <w:p>
       <w:r>
-        <w:t xml:space="preserve">Each device is offline only while its port is moved and bounced (disabled for 10 seconds, then enabled), and until it is back on the network with an address on its new VLAN. All work takes place within the change window under Suggested Scheduling.</w:t>
+        <w:t xml:space="preserve">Each device is offline only while its port is moved and bounced (disabled for 10 seconds, then enabled), and until it is back on the network with an address on its new VLAN. All work takes place within the change window under Suggested Scheduling. Each switch reload for the system-max change takes a few minutes and happens once, before the cutover on that switch.</w:t>
       </w:r>
     </w:p>
     <w:p>
@@ -2169,7 +2182,7 @@
                 <w:sz w:val="20"/>
                 <w:szCs w:val="20"/>
               </w:rPr>
-              <w:t xml:space="preserve">Pending</w:t>
+              <w:t xml:space="preserve">Complete</w:t>
             </w:r>
           </w:p>
         </w:tc>
@@ -2400,7 +2413,7 @@
     </w:p>
     <w:p>
       <w:r>
-        <w:t xml:space="preserve">The Wi-Fi change is rolled back in SmartZone by removing the three new WLANs from the 200v WLAN group and adding the four removed WLANs back with their recorded settings. The VLAN 2900 tagging on the AP ports can stay in place; it has no effect until an SSID uses it.</w:t>
+        <w:t xml:space="preserve">The system-max change has its own rollback block for each switch in system-max-spanning-tree-40-ICX.txt; it also needs a reload to take effect. The Wi-Fi change is rolled back in SmartZone by removing the three new WLANs from the 200v WLAN group and adding the four removed WLANs back with their recorded settings. The VLAN 2900 tagging on the AP ports can stay in place; it has no effect until an SSID uses it.</w:t>
       </w:r>
     </w:p>
     <w:p>

</xml_diff>

<commit_message>
Record the 9 Oct 2026 cutover in the workbook and change document
Workbook: cutover devices marked Done, Summary count, Switches result
column, Tutorial-6.03 1/1/3 and 1/1/9 noted, Review section 7 with the
cutover follow-ups. Document: prerequisites updated, new Cutover record
section with results, deviations (incl. the unplanned WIFIMGMT-IN ACL
change) and open items.

Co-Authored-By: Claude Opus 5.5 <noreply@anthropic.com>
Claude-Session: https://claude.ai/code/session_01BZ7jJsE6GWKm6ehHY39VNr
</commit_message>
<xml_diff>
--- a/Trinity 200V VLAN Migration.docx
+++ b/Trinity 200V VLAN Migration.docx
@@ -1959,7 +1959,7 @@
           <w:b/>
           <w:bCs/>
         </w:rPr>
-        <w:t xml:space="preserve">Prerequisites (status at 6 October 2026)</w:t>
+        <w:t xml:space="preserve">Prerequisites (status at 9 October 2026)</w:t>
       </w:r>
     </w:p>
     <w:tbl>
@@ -2104,7 +2104,7 @@
                 <w:sz w:val="20"/>
                 <w:szCs w:val="20"/>
               </w:rPr>
-              <w:t xml:space="preserve">Pending</w:t>
+              <w:t xml:space="preserve">Complete (9 October 2026)</w:t>
             </w:r>
           </w:p>
         </w:tc>
@@ -2299,7 +2299,7 @@
                 <w:sz w:val="20"/>
                 <w:szCs w:val="20"/>
               </w:rPr>
-              <w:t xml:space="preserve">Pending</w:t>
+              <w:t xml:space="preserve">Complete</w:t>
             </w:r>
           </w:p>
         </w:tc>
@@ -2730,6 +2730,637 @@
     <w:p>
       <w:r>
         <w:t xml:space="preserve">Note: the pilot (60 ports on lv3, lv4 and lv6) was completed and verified on Monday 5 October 2026.</w:t>
+      </w:r>
+    </w:p>
+    <w:p>
+      <w:pPr>
+        <w:keepNext/>
+        <w:spacing w:before="240" w:after="120"/>
+      </w:pPr>
+      <w:r>
+        <w:rPr>
+          <w:b/>
+          <w:bCs/>
+        </w:rPr>
+        <w:t xml:space="preserve">Cutover record – 9 October 2026</w:t>
+      </w:r>
+    </w:p>
+    <w:p>
+      <w:r>
+        <w:t xml:space="preserve">The system-max change and the VLAN cutover were made on all switches on Friday 9 October 2026. Every switch came back after its reload with spanning-tree current at 40, and the core saw all six access switches on both links of each LAG. All ports in the configuration file were moved.</w:t>
+      </w:r>
+    </w:p>
+    <w:p>
+      <w:pPr>
+        <w:spacing w:after="80"/>
+      </w:pPr>
+    </w:p>
+    <w:tbl>
+      <w:tblPr>
+        <w:tblW w:w="9026" w:type="dxa"/>
+        <w:tblBorders>
+          <w:top w:val="single" w:sz="4" w:space="0" w:color="A6A6A6"/>
+          <w:left w:val="single" w:sz="4" w:space="0" w:color="A6A6A6"/>
+          <w:bottom w:val="single" w:sz="4" w:space="0" w:color="A6A6A6"/>
+          <w:right w:val="single" w:sz="4" w:space="0" w:color="A6A6A6"/>
+          <w:insideH w:val="single" w:sz="4" w:space="0" w:color="A6A6A6"/>
+          <w:insideV w:val="single" w:sz="4" w:space="0" w:color="A6A6A6"/>
+        </w:tblBorders>
+        <w:tblLayout w:type="fixed"/>
+        <w:tblCellMar>
+          <w:top w:w="40" w:type="dxa"/>
+          <w:left w:w="80" w:type="dxa"/>
+          <w:bottom w:w="40" w:type="dxa"/>
+          <w:right w:w="80" w:type="dxa"/>
+        </w:tblCellMar>
+      </w:tblPr>
+      <w:tblGrid>
+        <w:gridCol w:w="3068"/>
+        <w:gridCol w:w="5958"/>
+      </w:tblGrid>
+      <w:tr>
+        <w:trPr>
+          <w:cantSplit/>
+          <w:tblHeader/>
+        </w:trPr>
+        <w:tc>
+          <w:tcPr>
+            <w:tcW w:w="3068" w:type="dxa"/>
+            <w:shd w:val="clear" w:color="auto" w:fill="D9D9D9"/>
+          </w:tcPr>
+          <w:p>
+            <w:pPr>
+              <w:spacing w:after="0" w:line="240" w:lineRule="auto"/>
+            </w:pPr>
+            <w:r>
+              <w:rPr>
+                <w:b/>
+                <w:bCs/>
+                <w:sz w:val="20"/>
+                <w:szCs w:val="20"/>
+              </w:rPr>
+              <w:t xml:space="preserve">Switch</w:t>
+            </w:r>
+          </w:p>
+        </w:tc>
+        <w:tc>
+          <w:tcPr>
+            <w:tcW w:w="5958" w:type="dxa"/>
+            <w:shd w:val="clear" w:color="auto" w:fill="D9D9D9"/>
+          </w:tcPr>
+          <w:p>
+            <w:pPr>
+              <w:spacing w:after="0" w:line="240" w:lineRule="auto"/>
+            </w:pPr>
+            <w:r>
+              <w:rPr>
+                <w:b/>
+                <w:bCs/>
+                <w:sz w:val="20"/>
+                <w:szCs w:val="20"/>
+              </w:rPr>
+              <w:t xml:space="preserve">Result</w:t>
+            </w:r>
+          </w:p>
+        </w:tc>
+      </w:tr>
+      <w:tr>
+        <w:trPr>
+          <w:cantSplit/>
+        </w:trPr>
+        <w:tc>
+          <w:tcPr>
+            <w:tcW w:w="3068" w:type="dxa"/>
+          </w:tcPr>
+          <w:p>
+            <w:pPr>
+              <w:spacing w:after="0" w:line="240" w:lineRule="auto"/>
+            </w:pPr>
+            <w:r>
+              <w:rPr>
+                <w:sz w:val="20"/>
+                <w:szCs w:val="20"/>
+              </w:rPr>
+              <w:t xml:space="preserve">trinity200V-core</w:t>
+            </w:r>
+          </w:p>
+        </w:tc>
+        <w:tc>
+          <w:tcPr>
+            <w:tcW w:w="5958" w:type="dxa"/>
+          </w:tcPr>
+          <w:p>
+            <w:pPr>
+              <w:spacing w:after="0" w:line="240" w:lineRule="auto"/>
+            </w:pPr>
+            <w:r>
+              <w:rPr>
+                <w:sz w:val="20"/>
+                <w:szCs w:val="20"/>
+              </w:rPr>
+              <w:t xml:space="preserve">Reloaded for system-max 40. WIFIMGMT-IN ACL changed (unplanned, see below)</w:t>
+            </w:r>
+          </w:p>
+        </w:tc>
+      </w:tr>
+      <w:tr>
+        <w:trPr>
+          <w:cantSplit/>
+        </w:trPr>
+        <w:tc>
+          <w:tcPr>
+            <w:tcW w:w="3068" w:type="dxa"/>
+          </w:tcPr>
+          <w:p>
+            <w:pPr>
+              <w:spacing w:after="0" w:line="240" w:lineRule="auto"/>
+            </w:pPr>
+            <w:r>
+              <w:rPr>
+                <w:sz w:val="20"/>
+                <w:szCs w:val="20"/>
+              </w:rPr>
+              <w:t xml:space="preserve">switch-200V-LT2-1</w:t>
+            </w:r>
+          </w:p>
+        </w:tc>
+        <w:tc>
+          <w:tcPr>
+            <w:tcW w:w="5958" w:type="dxa"/>
+          </w:tcPr>
+          <w:p>
+            <w:pPr>
+              <w:spacing w:after="0" w:line="240" w:lineRule="auto"/>
+            </w:pPr>
+            <w:r>
+              <w:rPr>
+                <w:sz w:val="20"/>
+                <w:szCs w:val="20"/>
+              </w:rPr>
+              <w:t xml:space="preserve">Cutover done, 16 ports; VLAN 2900 added on 1/1/1</w:t>
+            </w:r>
+          </w:p>
+        </w:tc>
+      </w:tr>
+      <w:tr>
+        <w:trPr>
+          <w:cantSplit/>
+        </w:trPr>
+        <w:tc>
+          <w:tcPr>
+            <w:tcW w:w="3068" w:type="dxa"/>
+          </w:tcPr>
+          <w:p>
+            <w:pPr>
+              <w:spacing w:after="0" w:line="240" w:lineRule="auto"/>
+            </w:pPr>
+            <w:r>
+              <w:rPr>
+                <w:sz w:val="20"/>
+                <w:szCs w:val="20"/>
+              </w:rPr>
+              <w:t xml:space="preserve">switch-200V-stack-lv6</w:t>
+            </w:r>
+          </w:p>
+        </w:tc>
+        <w:tc>
+          <w:tcPr>
+            <w:tcW w:w="5958" w:type="dxa"/>
+          </w:tcPr>
+          <w:p>
+            <w:pPr>
+              <w:spacing w:after="0" w:line="240" w:lineRule="auto"/>
+            </w:pPr>
+            <w:r>
+              <w:rPr>
+                <w:sz w:val="20"/>
+                <w:szCs w:val="20"/>
+              </w:rPr>
+              <w:t xml:space="preserve">Cutover done, 145 ports; spanning-tree enabled on 2600 and 2700. Units 3 and 4 left the stack during the cutover and were recovered by a reload; all 7 units Ready afterwards. Config saved</w:t>
+            </w:r>
+          </w:p>
+        </w:tc>
+      </w:tr>
+      <w:tr>
+        <w:trPr>
+          <w:cantSplit/>
+        </w:trPr>
+        <w:tc>
+          <w:tcPr>
+            <w:tcW w:w="3068" w:type="dxa"/>
+          </w:tcPr>
+          <w:p>
+            <w:pPr>
+              <w:spacing w:after="0" w:line="240" w:lineRule="auto"/>
+            </w:pPr>
+            <w:r>
+              <w:rPr>
+                <w:sz w:val="20"/>
+                <w:szCs w:val="20"/>
+              </w:rPr>
+              <w:t xml:space="preserve">switch-200V-stack-lv3</w:t>
+            </w:r>
+          </w:p>
+        </w:tc>
+        <w:tc>
+          <w:tcPr>
+            <w:tcW w:w="5958" w:type="dxa"/>
+          </w:tcPr>
+          <w:p>
+            <w:pPr>
+              <w:spacing w:after="0" w:line="240" w:lineRule="auto"/>
+            </w:pPr>
+            <w:r>
+              <w:rPr>
+                <w:sz w:val="20"/>
+                <w:szCs w:val="20"/>
+              </w:rPr>
+              <w:t xml:space="preserve">Cutover done, 84 ports</w:t>
+            </w:r>
+          </w:p>
+        </w:tc>
+      </w:tr>
+      <w:tr>
+        <w:trPr>
+          <w:cantSplit/>
+        </w:trPr>
+        <w:tc>
+          <w:tcPr>
+            <w:tcW w:w="3068" w:type="dxa"/>
+          </w:tcPr>
+          <w:p>
+            <w:pPr>
+              <w:spacing w:after="0" w:line="240" w:lineRule="auto"/>
+            </w:pPr>
+            <w:r>
+              <w:rPr>
+                <w:sz w:val="20"/>
+                <w:szCs w:val="20"/>
+              </w:rPr>
+              <w:t xml:space="preserve">switch-200V-stack-lv4</w:t>
+            </w:r>
+          </w:p>
+        </w:tc>
+        <w:tc>
+          <w:tcPr>
+            <w:tcW w:w="5958" w:type="dxa"/>
+          </w:tcPr>
+          <w:p>
+            <w:pPr>
+              <w:spacing w:after="0" w:line="240" w:lineRule="auto"/>
+            </w:pPr>
+            <w:r>
+              <w:rPr>
+                <w:sz w:val="20"/>
+                <w:szCs w:val="20"/>
+              </w:rPr>
+              <w:t xml:space="preserve">Cutover done, 89 ports</w:t>
+            </w:r>
+          </w:p>
+        </w:tc>
+      </w:tr>
+      <w:tr>
+        <w:trPr>
+          <w:cantSplit/>
+        </w:trPr>
+        <w:tc>
+          <w:tcPr>
+            <w:tcW w:w="3068" w:type="dxa"/>
+          </w:tcPr>
+          <w:p>
+            <w:pPr>
+              <w:spacing w:after="0" w:line="240" w:lineRule="auto"/>
+            </w:pPr>
+            <w:r>
+              <w:rPr>
+                <w:sz w:val="20"/>
+                <w:szCs w:val="20"/>
+              </w:rPr>
+              <w:t xml:space="preserve">switch-200V-Tutorial-6.03</w:t>
+            </w:r>
+          </w:p>
+        </w:tc>
+        <w:tc>
+          <w:tcPr>
+            <w:tcW w:w="5958" w:type="dxa"/>
+          </w:tcPr>
+          <w:p>
+            <w:pPr>
+              <w:spacing w:after="0" w:line="240" w:lineRule="auto"/>
+            </w:pPr>
+            <w:r>
+              <w:rPr>
+                <w:sz w:val="20"/>
+                <w:szCs w:val="20"/>
+              </w:rPr>
+              <w:t xml:space="preserve">Cutover done over console, 6 ports plus 1/1/3 and 1/1/9 (see below)</w:t>
+            </w:r>
+          </w:p>
+        </w:tc>
+      </w:tr>
+      <w:tr>
+        <w:trPr>
+          <w:cantSplit/>
+        </w:trPr>
+        <w:tc>
+          <w:tcPr>
+            <w:tcW w:w="3068" w:type="dxa"/>
+          </w:tcPr>
+          <w:p>
+            <w:pPr>
+              <w:spacing w:after="0" w:line="240" w:lineRule="auto"/>
+            </w:pPr>
+            <w:r>
+              <w:rPr>
+                <w:sz w:val="20"/>
+                <w:szCs w:val="20"/>
+              </w:rPr>
+              <w:t xml:space="preserve">switch-200V-LT2-2, switch-200V-LT2-3, switch-200V-8</w:t>
+            </w:r>
+          </w:p>
+        </w:tc>
+        <w:tc>
+          <w:tcPr>
+            <w:tcW w:w="5958" w:type="dxa"/>
+          </w:tcPr>
+          <w:p>
+            <w:pPr>
+              <w:spacing w:after="0" w:line="240" w:lineRule="auto"/>
+            </w:pPr>
+            <w:r>
+              <w:rPr>
+                <w:sz w:val="20"/>
+                <w:szCs w:val="20"/>
+              </w:rPr>
+              <w:t xml:space="preserve">system-max change only</w:t>
+            </w:r>
+          </w:p>
+        </w:tc>
+      </w:tr>
+      <w:tr>
+        <w:trPr>
+          <w:cantSplit/>
+        </w:trPr>
+        <w:tc>
+          <w:tcPr>
+            <w:tcW w:w="3068" w:type="dxa"/>
+          </w:tcPr>
+          <w:p>
+            <w:pPr>
+              <w:spacing w:after="0" w:line="240" w:lineRule="auto"/>
+            </w:pPr>
+            <w:r>
+              <w:rPr>
+                <w:sz w:val="20"/>
+                <w:szCs w:val="20"/>
+              </w:rPr>
+              <w:t xml:space="preserve">SmartZone 200v WLAN group</w:t>
+            </w:r>
+          </w:p>
+        </w:tc>
+        <w:tc>
+          <w:tcPr>
+            <w:tcW w:w="5958" w:type="dxa"/>
+          </w:tcPr>
+          <w:p>
+            <w:pPr>
+              <w:spacing w:after="0" w:line="240" w:lineRule="auto"/>
+            </w:pPr>
+            <w:r>
+              <w:rPr>
+                <w:sz w:val="20"/>
+                <w:szCs w:val="20"/>
+              </w:rPr>
+              <w:t xml:space="preserve">Changed to eduroam v2900, Trinity Visitor v2900 and Trinity Wireless v2300, all with VLAN override Default</w:t>
+            </w:r>
+          </w:p>
+        </w:tc>
+      </w:tr>
+    </w:tbl>
+    <w:p>
+      <w:pPr>
+        <w:spacing w:after="80"/>
+      </w:pPr>
+    </w:p>
+    <w:p>
+      <w:pPr>
+        <w:keepNext/>
+        <w:spacing w:before="240" w:after="120"/>
+      </w:pPr>
+      <w:r>
+        <w:rPr>
+          <w:b/>
+          <w:bCs/>
+        </w:rPr>
+        <w:t xml:space="preserve">Deviations from the plan</w:t>
+      </w:r>
+    </w:p>
+    <w:p>
+      <w:pPr>
+        <w:pStyle w:val="ListParagraph"/>
+        <w:numPr>
+          <w:ilvl w:val="0"/>
+          <w:numId w:val="1"/>
+        </w:numPr>
+        <w:spacing w:after="60"/>
+      </w:pPr>
+      <w:r>
+        <w:t xml:space="preserve">Unplanned change on trinity200V-core: APs moved to VLAN 2010 kept dropping off SmartZone because the WIFIMGMT-IN ACL denied the SmartZone private node addresses. Two entries were added: sequence 23 permit ip 10.21.1.0 0.0.0.255 host 192.168.81.100 and sequence 24 permit ip 10.21.1.0 0.0.0.255 host 192.168.245.100. The APs were stable afterwards</w:t>
+      </w:r>
+    </w:p>
+    <w:p>
+      <w:pPr>
+        <w:pStyle w:val="ListParagraph"/>
+        <w:numPr>
+          <w:ilvl w:val="0"/>
+          <w:numId w:val="1"/>
+        </w:numPr>
+        <w:spacing w:after="60"/>
+      </w:pPr>
+      <w:r>
+        <w:t xml:space="preserve">VLAN 2900 was missing on the LT2-1 AP port at the start and was added before that AP was moved</w:t>
+      </w:r>
+    </w:p>
+    <w:p>
+      <w:pPr>
+        <w:pStyle w:val="ListParagraph"/>
+        <w:numPr>
+          <w:ilvl w:val="0"/>
+          <w:numId w:val="1"/>
+        </w:numPr>
+        <w:spacing w:after="60"/>
+      </w:pPr>
+      <w:r>
+        <w:t xml:space="preserve">lv6: units 3 and 4 left the stack during the cutover. The stack was reloaded and all units rejoined; the ports were checked afterwards. lv6 is cabled as a chain rather than a ring</w:t>
+      </w:r>
+    </w:p>
+    <w:p>
+      <w:pPr>
+        <w:pStyle w:val="ListParagraph"/>
+        <w:numPr>
+          <w:ilvl w:val="0"/>
+          <w:numId w:val="1"/>
+        </w:numPr>
+        <w:spacing w:after="60"/>
+      </w:pPr>
+      <w:r>
+        <w:t xml:space="preserve">lv6: printer 200v-lvl-6-staff-corridor (7/1/19) briefly ended up on VLAN 2700 after a cut-short paste and was moved to 2800 the same night</w:t>
+      </w:r>
+    </w:p>
+    <w:p>
+      <w:pPr>
+        <w:pStyle w:val="ListParagraph"/>
+        <w:numPr>
+          <w:ilvl w:val="0"/>
+          <w:numId w:val="1"/>
+        </w:numPr>
+        <w:spacing w:after="60"/>
+      </w:pPr>
+      <w:r>
+        <w:t xml:space="preserve">On lv6, lv4 and Tutorial-6.03 the port enable step was missed at first and re-run</w:t>
+      </w:r>
+    </w:p>
+    <w:p>
+      <w:pPr>
+        <w:pStyle w:val="ListParagraph"/>
+        <w:numPr>
+          <w:ilvl w:val="0"/>
+          <w:numId w:val="1"/>
+        </w:numPr>
+        <w:spacing w:after="60"/>
+      </w:pPr>
+      <w:r>
+        <w:t xml:space="preserve">Tutorial-6.03: ports 1/1/3 and 1/1/9 had devices on VLAN 1230 that were not in the device list (1/1/9 is the AV Switcher 00:1D:56:0A:DF:C0). Both were moved to VLAN 2700 on site</w:t>
+      </w:r>
+    </w:p>
+    <w:p>
+      <w:pPr>
+        <w:pStyle w:val="ListParagraph"/>
+        <w:numPr>
+          <w:ilvl w:val="0"/>
+          <w:numId w:val="1"/>
+        </w:numPr>
+        <w:spacing w:after="60"/>
+      </w:pPr>
+      <w:r>
+        <w:t xml:space="preserve">Trinity NetSegPilot is not in the 200v WLAN group, although the plan was to keep it</w:t>
+      </w:r>
+    </w:p>
+    <w:p>
+      <w:pPr>
+        <w:keepNext/>
+        <w:spacing w:before="240" w:after="120"/>
+      </w:pPr>
+      <w:r>
+        <w:rPr>
+          <w:b/>
+          <w:bCs/>
+        </w:rPr>
+        <w:t xml:space="preserve">Open items</w:t>
+      </w:r>
+    </w:p>
+    <w:p>
+      <w:pPr>
+        <w:pStyle w:val="ListParagraph"/>
+        <w:numPr>
+          <w:ilvl w:val="0"/>
+          <w:numId w:val="1"/>
+        </w:numPr>
+        <w:spacing w:after="60"/>
+      </w:pPr>
+      <w:r>
+        <w:t xml:space="preserve">Trinity Wireless v2300: clients authenticate but get no address. Being investigated (DHCP relay, STUDENT-GROUP-IN ACL and the 10.21.8.0/21 scope)</w:t>
+      </w:r>
+    </w:p>
+    <w:p>
+      <w:pPr>
+        <w:pStyle w:val="ListParagraph"/>
+        <w:numPr>
+          <w:ilvl w:val="0"/>
+          <w:numId w:val="1"/>
+        </w:numPr>
+        <w:spacing w:after="60"/>
+      </w:pPr>
+      <w:r>
+        <w:t xml:space="preserve">Confirm whether Trinity NetSegPilot should be added back to the 200v WLAN group</w:t>
+      </w:r>
+    </w:p>
+    <w:p>
+      <w:pPr>
+        <w:pStyle w:val="ListParagraph"/>
+        <w:numPr>
+          <w:ilvl w:val="0"/>
+          <w:numId w:val="1"/>
+        </w:numPr>
+        <w:spacing w:after="60"/>
+      </w:pPr>
+      <w:r>
+        <w:t xml:space="preserve">Test every SSID with a client and confirm all 200V APs, including lv4, are online in SmartZone</w:t>
+      </w:r>
+    </w:p>
+    <w:p>
+      <w:pPr>
+        <w:pStyle w:val="ListParagraph"/>
+        <w:numPr>
+          <w:ilvl w:val="0"/>
+          <w:numId w:val="1"/>
+        </w:numPr>
+        <w:spacing w:after="60"/>
+      </w:pPr>
+      <w:r>
+        <w:t xml:space="preserve">Confirm write memory on lv3, lv4, Tutorial-6.03 and the core</w:t>
+      </w:r>
+    </w:p>
+    <w:p>
+      <w:pPr>
+        <w:pStyle w:val="ListParagraph"/>
+        <w:numPr>
+          <w:ilvl w:val="0"/>
+          <w:numId w:val="1"/>
+        </w:numPr>
+        <w:spacing w:after="60"/>
+      </w:pPr>
+      <w:r>
+        <w:t xml:space="preserve">Check show span vlan 2600 on lv6 (lg10 forwarding)</w:t>
+      </w:r>
+    </w:p>
+    <w:p>
+      <w:pPr>
+        <w:pStyle w:val="ListParagraph"/>
+        <w:numPr>
+          <w:ilvl w:val="0"/>
+          <w:numId w:val="1"/>
+        </w:numPr>
+        <w:spacing w:after="60"/>
+      </w:pPr>
+      <w:r>
+        <w:t xml:space="preserve">AV team to check on Saturday six AV devices not yet seen on VLAN 2700: Projector Screen 1 and 2 (LT2-1 1/1/16, 1/1/15), Projector Screen Left (lv4 4/1/41), Projector Right and Left (lv4 5/1/37, 5/1/39) and the PDU (Tutorial-6.03 1/1/8)</w:t>
+      </w:r>
+    </w:p>
+    <w:p>
+      <w:pPr>
+        <w:pStyle w:val="ListParagraph"/>
+        <w:numPr>
+          <w:ilvl w:val="0"/>
+          <w:numId w:val="1"/>
+        </w:numPr>
+        <w:spacing w:after="60"/>
+      </w:pPr>
+      <w:r>
+        <w:t xml:space="preserve">Add the two Tutorial-6.03 devices on 1/1/3 and 1/1/9 to the master list</w:t>
+      </w:r>
+    </w:p>
+    <w:p>
+      <w:pPr>
+        <w:pStyle w:val="ListParagraph"/>
+        <w:numPr>
+          <w:ilvl w:val="0"/>
+          <w:numId w:val="1"/>
+        </w:numPr>
+        <w:spacing w:after="60"/>
+      </w:pPr>
+      <w:r>
+        <w:t xml:space="preserve">Later window: add the closing stack cable on lv6 and lv4, and lower the spanning-tree priority on trinity200V-core (switch-200V-8 is currently root)</w:t>
       </w:r>
     </w:p>
     <w:p>

</xml_diff>

<commit_message>
Change document: add the Review tab changes to the cutover record
Co-Authored-By: Claude Opus 5.5 <noreply@anthropic.com>
Claude-Session: https://claude.ai/code/session_01BZ7jJsE6GWKm6ehHY39VNr
</commit_message>
<xml_diff>
--- a/Trinity 200V VLAN Migration.docx
+++ b/Trinity 200V VLAN Migration.docx
@@ -3256,6 +3256,312 @@
           <w:b/>
           <w:bCs/>
         </w:rPr>
+        <w:t xml:space="preserve">Review tab changes</w:t>
+      </w:r>
+    </w:p>
+    <w:p>
+      <w:r>
+        <w:t xml:space="preserve">After the cutover, the ports that the Review tab comments gave a new VLAN were also moved, using 200V-review-changes-ICX.txt. 18 of the 20 ports were moved and saved; each switch was pre-checked and verified.</w:t>
+      </w:r>
+    </w:p>
+    <w:p>
+      <w:pPr>
+        <w:spacing w:after="80"/>
+      </w:pPr>
+    </w:p>
+    <w:tbl>
+      <w:tblPr>
+        <w:tblW w:w="9026" w:type="dxa"/>
+        <w:tblBorders>
+          <w:top w:val="single" w:sz="4" w:space="0" w:color="A6A6A6"/>
+          <w:left w:val="single" w:sz="4" w:space="0" w:color="A6A6A6"/>
+          <w:bottom w:val="single" w:sz="4" w:space="0" w:color="A6A6A6"/>
+          <w:right w:val="single" w:sz="4" w:space="0" w:color="A6A6A6"/>
+          <w:insideH w:val="single" w:sz="4" w:space="0" w:color="A6A6A6"/>
+          <w:insideV w:val="single" w:sz="4" w:space="0" w:color="A6A6A6"/>
+        </w:tblBorders>
+        <w:tblLayout w:type="fixed"/>
+        <w:tblCellMar>
+          <w:top w:w="40" w:type="dxa"/>
+          <w:left w:w="80" w:type="dxa"/>
+          <w:bottom w:w="40" w:type="dxa"/>
+          <w:right w:w="80" w:type="dxa"/>
+        </w:tblCellMar>
+      </w:tblPr>
+      <w:tblGrid>
+        <w:gridCol w:w="3068"/>
+        <w:gridCol w:w="5958"/>
+      </w:tblGrid>
+      <w:tr>
+        <w:trPr>
+          <w:cantSplit/>
+          <w:tblHeader/>
+        </w:trPr>
+        <w:tc>
+          <w:tcPr>
+            <w:tcW w:w="3068" w:type="dxa"/>
+            <w:shd w:val="clear" w:color="auto" w:fill="D9D9D9"/>
+          </w:tcPr>
+          <w:p>
+            <w:pPr>
+              <w:spacing w:after="0" w:line="240" w:lineRule="auto"/>
+            </w:pPr>
+            <w:r>
+              <w:rPr>
+                <w:b/>
+                <w:bCs/>
+                <w:sz w:val="20"/>
+                <w:szCs w:val="20"/>
+              </w:rPr>
+              <w:t xml:space="preserve">Switch</w:t>
+            </w:r>
+          </w:p>
+        </w:tc>
+        <w:tc>
+          <w:tcPr>
+            <w:tcW w:w="5958" w:type="dxa"/>
+            <w:shd w:val="clear" w:color="auto" w:fill="D9D9D9"/>
+          </w:tcPr>
+          <w:p>
+            <w:pPr>
+              <w:spacing w:after="0" w:line="240" w:lineRule="auto"/>
+            </w:pPr>
+            <w:r>
+              <w:rPr>
+                <w:b/>
+                <w:bCs/>
+                <w:sz w:val="20"/>
+                <w:szCs w:val="20"/>
+              </w:rPr>
+              <w:t xml:space="preserve">Ports moved</w:t>
+            </w:r>
+          </w:p>
+        </w:tc>
+      </w:tr>
+      <w:tr>
+        <w:trPr>
+          <w:cantSplit/>
+        </w:trPr>
+        <w:tc>
+          <w:tcPr>
+            <w:tcW w:w="3068" w:type="dxa"/>
+          </w:tcPr>
+          <w:p>
+            <w:pPr>
+              <w:spacing w:after="0" w:line="240" w:lineRule="auto"/>
+            </w:pPr>
+            <w:r>
+              <w:rPr>
+                <w:sz w:val="20"/>
+                <w:szCs w:val="20"/>
+              </w:rPr>
+              <w:t xml:space="preserve">switch-200V-LT2-3</w:t>
+            </w:r>
+          </w:p>
+        </w:tc>
+        <w:tc>
+          <w:tcPr>
+            <w:tcW w:w="5958" w:type="dxa"/>
+          </w:tcPr>
+          <w:p>
+            <w:pPr>
+              <w:spacing w:after="0" w:line="240" w:lineRule="auto"/>
+            </w:pPr>
+            <w:r>
+              <w:rPr>
+                <w:sz w:val="20"/>
+                <w:szCs w:val="20"/>
+              </w:rPr>
+              <w:t xml:space="preserve">1/1/4: 1240 to 2100</w:t>
+            </w:r>
+          </w:p>
+        </w:tc>
+      </w:tr>
+      <w:tr>
+        <w:trPr>
+          <w:cantSplit/>
+        </w:trPr>
+        <w:tc>
+          <w:tcPr>
+            <w:tcW w:w="3068" w:type="dxa"/>
+          </w:tcPr>
+          <w:p>
+            <w:pPr>
+              <w:spacing w:after="0" w:line="240" w:lineRule="auto"/>
+            </w:pPr>
+            <w:r>
+              <w:rPr>
+                <w:sz w:val="20"/>
+                <w:szCs w:val="20"/>
+              </w:rPr>
+              <w:t xml:space="preserve">switch-200V-stack-lv3</w:t>
+            </w:r>
+          </w:p>
+        </w:tc>
+        <w:tc>
+          <w:tcPr>
+            <w:tcW w:w="5958" w:type="dxa"/>
+          </w:tcPr>
+          <w:p>
+            <w:pPr>
+              <w:spacing w:after="0" w:line="240" w:lineRule="auto"/>
+            </w:pPr>
+            <w:r>
+              <w:rPr>
+                <w:sz w:val="20"/>
+                <w:szCs w:val="20"/>
+              </w:rPr>
+              <w:t xml:space="preserve">3/1/5, 3/1/31, 3/1/33, 3/1/43, 4/1/28: 1240 to 2100; 3/1/29, 4/1/29: 230 to 2530</w:t>
+            </w:r>
+          </w:p>
+        </w:tc>
+      </w:tr>
+      <w:tr>
+        <w:trPr>
+          <w:cantSplit/>
+        </w:trPr>
+        <w:tc>
+          <w:tcPr>
+            <w:tcW w:w="3068" w:type="dxa"/>
+          </w:tcPr>
+          <w:p>
+            <w:pPr>
+              <w:spacing w:after="0" w:line="240" w:lineRule="auto"/>
+            </w:pPr>
+            <w:r>
+              <w:rPr>
+                <w:sz w:val="20"/>
+                <w:szCs w:val="20"/>
+              </w:rPr>
+              <w:t xml:space="preserve">switch-200V-stack-lv4</w:t>
+            </w:r>
+          </w:p>
+        </w:tc>
+        <w:tc>
+          <w:tcPr>
+            <w:tcW w:w="5958" w:type="dxa"/>
+          </w:tcPr>
+          <w:p>
+            <w:pPr>
+              <w:spacing w:after="0" w:line="240" w:lineRule="auto"/>
+            </w:pPr>
+            <w:r>
+              <w:rPr>
+                <w:sz w:val="20"/>
+                <w:szCs w:val="20"/>
+              </w:rPr>
+              <w:t xml:space="preserve">3/1/7, 3/1/28: 1240 to 2100</w:t>
+            </w:r>
+          </w:p>
+        </w:tc>
+      </w:tr>
+      <w:tr>
+        <w:trPr>
+          <w:cantSplit/>
+        </w:trPr>
+        <w:tc>
+          <w:tcPr>
+            <w:tcW w:w="3068" w:type="dxa"/>
+          </w:tcPr>
+          <w:p>
+            <w:pPr>
+              <w:spacing w:after="0" w:line="240" w:lineRule="auto"/>
+            </w:pPr>
+            <w:r>
+              <w:rPr>
+                <w:sz w:val="20"/>
+                <w:szCs w:val="20"/>
+              </w:rPr>
+              <w:t xml:space="preserve">switch-200V-stack-lv6</w:t>
+            </w:r>
+          </w:p>
+        </w:tc>
+        <w:tc>
+          <w:tcPr>
+            <w:tcW w:w="5958" w:type="dxa"/>
+          </w:tcPr>
+          <w:p>
+            <w:pPr>
+              <w:spacing w:after="0" w:line="240" w:lineRule="auto"/>
+            </w:pPr>
+            <w:r>
+              <w:rPr>
+                <w:sz w:val="20"/>
+                <w:szCs w:val="20"/>
+              </w:rPr>
+              <w:t xml:space="preserve">1/1/31, 3/1/1, 4/1/1, 5/1/30, 5/1/48, 6/1/16, 6/1/22, 6/1/31: 1240 to 2100 (1/1/31 keeps 1272 and 1273 tagged)</w:t>
+            </w:r>
+          </w:p>
+        </w:tc>
+      </w:tr>
+    </w:tbl>
+    <w:p>
+      <w:pPr>
+        <w:spacing w:after="80"/>
+      </w:pPr>
+    </w:p>
+    <w:p>
+      <w:pPr>
+        <w:pStyle w:val="ListParagraph"/>
+        <w:numPr>
+          <w:ilvl w:val="0"/>
+          <w:numId w:val="1"/>
+        </w:numPr>
+        <w:spacing w:after="60"/>
+      </w:pPr>
+      <w:r>
+        <w:t xml:space="preserve">Devices seen on their new VLAN: lv3 3/1/29 and 4/1/29 (2530); lv6 5/1/30, 6/1/16 and 6/1/31 (2100)</w:t>
+      </w:r>
+    </w:p>
+    <w:p>
+      <w:pPr>
+        <w:pStyle w:val="ListParagraph"/>
+        <w:numPr>
+          <w:ilvl w:val="0"/>
+          <w:numId w:val="1"/>
+        </w:numPr>
+        <w:spacing w:after="60"/>
+      </w:pPr>
+      <w:r>
+        <w:t xml:space="preserve">Link up but no MAC learned yet, most likely idle devices: lv3 3/1/33 and 3/1/43; lv6 1/1/31, 4/1/1 and 5/1/48</w:t>
+      </w:r>
+    </w:p>
+    <w:p>
+      <w:pPr>
+        <w:pStyle w:val="ListParagraph"/>
+        <w:numPr>
+          <w:ilvl w:val="0"/>
+          <w:numId w:val="1"/>
+        </w:numPr>
+        <w:spacing w:after="60"/>
+      </w:pPr>
+      <w:r>
+        <w:t xml:space="preserve">No link (nothing connected): LT2-3 1/1/4; lv3 3/1/5, 3/1/31 and 4/1/28; lv4 3/1/7 and 3/1/28; lv6 3/1/1 and 6/1/22. These devices get an address on the new VLAN when they next connect</w:t>
+      </w:r>
+    </w:p>
+    <w:p>
+      <w:pPr>
+        <w:pStyle w:val="ListParagraph"/>
+        <w:numPr>
+          <w:ilvl w:val="0"/>
+          <w:numId w:val="1"/>
+        </w:numPr>
+        <w:spacing w:after="60"/>
+      </w:pPr>
+      <w:r>
+        <w:t xml:space="preserve">Not moved: lv3 1/1/48 and lv4 1/1/48 (00:09:F5 devices on VLAN 100) were left on VLAN 100 because it is not known whether they have a fixed address. They move to VLAN 2000 (10.21.0.0/24) once that is confirmed</w:t>
+      </w:r>
+    </w:p>
+    <w:p>
+      <w:pPr>
+        <w:keepNext/>
+        <w:spacing w:before="240" w:after="120"/>
+      </w:pPr>
+      <w:r>
+        <w:rPr>
+          <w:b/>
+          <w:bCs/>
+        </w:rPr>
         <w:t xml:space="preserve">Open items</w:t>
       </w:r>
     </w:p>
@@ -3348,6 +3654,32 @@
       </w:pPr>
       <w:r>
         <w:t xml:space="preserve">Add the two Tutorial-6.03 devices on 1/1/3 and 1/1/9 to the master list</w:t>
+      </w:r>
+    </w:p>
+    <w:p>
+      <w:pPr>
+        <w:pStyle w:val="ListParagraph"/>
+        <w:numPr>
+          <w:ilvl w:val="0"/>
+          <w:numId w:val="1"/>
+        </w:numPr>
+        <w:spacing w:after="60"/>
+      </w:pPr>
+      <w:r>
+        <w:t xml:space="preserve">Check the Review tab ports with link but no MAC (show mac-address vlan 2100 on lv3 and lv6)</w:t>
+      </w:r>
+    </w:p>
+    <w:p>
+      <w:pPr>
+        <w:pStyle w:val="ListParagraph"/>
+        <w:numPr>
+          <w:ilvl w:val="0"/>
+          <w:numId w:val="1"/>
+        </w:numPr>
+        <w:spacing w:after="60"/>
+      </w:pPr>
+      <w:r>
+        <w:t xml:space="preserve">Confirm the addressing of the devices on lv3 1/1/48 and lv4 1/1/48, then move them to VLAN 2000</w:t>
       </w:r>
     </w:p>
     <w:p>

</xml_diff>

<commit_message>
Change document: Trinity Wireless RADIUS fix (WIFIMGMT-IN sequence 25) and open items
Co-Authored-By: Claude Opus 5.5 <noreply@anthropic.com>
Claude-Session: https://claude.ai/code/session_01BZ7jJsE6GWKm6ehHY39VNr
</commit_message>
<xml_diff>
--- a/Trinity 200V VLAN Migration.docx
+++ b/Trinity 200V VLAN Migration.docx
@@ -2858,7 +2858,7 @@
                 <w:sz w:val="20"/>
                 <w:szCs w:val="20"/>
               </w:rPr>
-              <w:t xml:space="preserve">Reloaded for system-max 40. WIFIMGMT-IN ACL changed (unplanned, see below)</w:t>
+              <w:t xml:space="preserve">Reloaded for system-max 40. WIFIMGMT-IN ACL: three entries added (sequences 23, 24 and 25; unplanned, see below)</w:t>
             </w:r>
           </w:p>
         </w:tc>
@@ -3092,7 +3092,7 @@
                 <w:sz w:val="20"/>
                 <w:szCs w:val="20"/>
               </w:rPr>
-              <w:t xml:space="preserve">system-max change only</w:t>
+              <w:t xml:space="preserve">system-max change only (LT2-3 1/1/4 later moved; see Review tab changes)</w:t>
             </w:r>
           </w:p>
         </w:tc>
@@ -3131,7 +3131,7 @@
                 <w:sz w:val="20"/>
                 <w:szCs w:val="20"/>
               </w:rPr>
-              <w:t xml:space="preserve">Changed to eduroam v2900, Trinity Visitor v2900 and Trinity Wireless v2300, all with VLAN override Default</w:t>
+              <w:t xml:space="preserve">Changed to eduroam v2900, Trinity Visitor v2900 and Trinity Wireless v2300, all with VLAN override Default. Trinity Wireless working after the WIFIMGMT-IN change</w:t>
             </w:r>
           </w:p>
         </w:tc>
@@ -3166,6 +3166,32 @@
       </w:pPr>
       <w:r>
         <w:t xml:space="preserve">Unplanned change on trinity200V-core: APs moved to VLAN 2010 kept dropping off SmartZone because the WIFIMGMT-IN ACL denied the SmartZone private node addresses. Two entries were added: sequence 23 permit ip 10.21.1.0 0.0.0.255 host 192.168.81.100 and sequence 24 permit ip 10.21.1.0 0.0.0.255 host 192.168.245.100. The APs were stable afterwards</w:t>
+      </w:r>
+    </w:p>
+    <w:p>
+      <w:pPr>
+        <w:pStyle w:val="ListParagraph"/>
+        <w:numPr>
+          <w:ilvl w:val="0"/>
+          <w:numId w:val="1"/>
+        </w:numPr>
+        <w:spacing w:after="60"/>
+      </w:pPr>
+      <w:r>
+        <w:t xml:space="preserve">Unplanned change on trinity200V-core: Trinity Wireless clients could not authenticate. The SmartZone AAA server for the WLAN (pause-radius03 Trinity Wireless, FreeRADIUS at 10.128.131.7, UDP 18200) is not proxied, so the APs send RADIUS requests directly from 10.21.1.0/24, and WIFIMGMT-IN denied them (sequence 30 denies 10.0.0.0/8; only 10.128.128.0/24 was permitted). Sequence 25 permit udp 10.21.1.0 0.0.0.255 host 10.128.131.7 was added. Two example entries for 10.20.16.10 (UDP 1812 and 1813) were pasted in error at first and removed straight away. The path was checked with ping and traceroute from 10.21.1.1 (via 10.20.8.1, 10.136.0.2 and 10.128.16.6), and Trinity Wireless then authenticated</w:t>
+      </w:r>
+    </w:p>
+    <w:p>
+      <w:pPr>
+        <w:pStyle w:val="ListParagraph"/>
+        <w:numPr>
+          <w:ilvl w:val="0"/>
+          <w:numId w:val="1"/>
+        </w:numPr>
+        <w:spacing w:after="60"/>
+      </w:pPr>
+      <w:r>
+        <w:t xml:space="preserve">Before the authentication issue, Trinity Wireless v2300 clients were reported as getting no address. The 200v WLAN group was checked and all VLAN overrides are Default (Trinity Wireless v2300 on VLAN 2300)</w:t>
       </w:r>
     </w:p>
     <w:p>
@@ -3575,7 +3601,20 @@
         <w:spacing w:after="60"/>
       </w:pPr>
       <w:r>
-        <w:t xml:space="preserve">Trinity Wireless v2300: clients authenticate but get no address. Being investigated (DHCP relay, STUDENT-GROUP-IN ACL and the 10.21.8.0/21 scope)</w:t>
+        <w:t xml:space="preserve">Trinity Wireless: confirm clients get a 10.21.8.x address, and confirm whether any change was also made on the FreeRADIUS server (clients.conf) or the firewall at 10.136.0.2 for 10.21.1.0/24, so it can be recorded</w:t>
+      </w:r>
+    </w:p>
+    <w:p>
+      <w:pPr>
+        <w:pStyle w:val="ListParagraph"/>
+        <w:numPr>
+          <w:ilvl w:val="0"/>
+          <w:numId w:val="1"/>
+        </w:numPr>
+        <w:spacing w:after="60"/>
+      </w:pPr>
+      <w:r>
+        <w:t xml:space="preserve">eduroam v2900 and Trinity Visitor v2900: test both (10.21.29.x). If eduroam uses a RADIUS server outside 10.128.128.0/24, 192.168.12.0/24 and 10.128.131.7, WIFIMGMT-IN needs an entry for it as well</w:t>
       </w:r>
     </w:p>
     <w:p>
@@ -3614,7 +3653,7 @@
         <w:spacing w:after="60"/>
       </w:pPr>
       <w:r>
-        <w:t xml:space="preserve">Confirm write memory on lv3, lv4, Tutorial-6.03 and the core</w:t>
+        <w:t xml:space="preserve">Confirm write memory on lv4 and Tutorial-6.03 (lv3, lv6, LT2-3 and the core are saved)</w:t>
       </w:r>
     </w:p>
     <w:p>

</xml_diff>

<commit_message>
Record the 16 unlisted AV devices moved to 2700 on lv3 and lv4
Workbook Review items and ports marked Done, Switches results updated;
config file status line; change document Review tab changes and open
items (NUC-type ports and other unlisted AV devices).

Co-Authored-By: Claude Opus 5.5 <noreply@anthropic.com>
Claude-Session: https://claude.ai/code/session_01BZ7jJsE6GWKm6ehHY39VNr
</commit_message>
<xml_diff>
--- a/Trinity 200V VLAN Migration.docx
+++ b/Trinity 200V VLAN Migration.docx
@@ -3579,6 +3579,11 @@
       </w:r>
     </w:p>
     <w:p>
+      <w:r>
+        <w:t xml:space="preserve">16 further devices with near-consecutive MACs D8:43:AE:B1:xx:xx, one per room on the old AV VLAN 1230 and not in the device list, were moved to VLAN 2700 with the rest of the room AV using 200V-av-unlisted-2700-ICX.txt: lv3 2/1/16, 2/1/29, 4/1/41, 4/1/46, 5/1/18, 5/1/24, 5/1/26 and 5/1/45; lv4 1/1/14, 1/1/28, 2/1/21, 4/1/6, 5/1/7, 5/1/12, 5/1/21 and 5/1/29 (Review items 26, 27, 35-42, 44, 47 and 50-53).</w:t>
+      </w:r>
+    </w:p>
+    <w:p>
       <w:pPr>
         <w:keepNext/>
         <w:spacing w:before="240" w:after="120"/>
@@ -3719,6 +3724,32 @@
       </w:pPr>
       <w:r>
         <w:t xml:space="preserve">Confirm the addressing of the devices on lv3 1/1/48 and lv4 1/1/48, then move them to VLAN 2000</w:t>
+      </w:r>
+    </w:p>
+    <w:p>
+      <w:pPr>
+        <w:pStyle w:val="ListParagraph"/>
+        <w:numPr>
+          <w:ilvl w:val="0"/>
+          <w:numId w:val="1"/>
+        </w:numPr>
+        <w:spacing w:after="60"/>
+      </w:pPr>
+      <w:r>
+        <w:t xml:space="preserve">Room NUC-type devices not on 2700: LT2-1 1/1/21 (CLA-TAN3130059J, still on 1240) and lv6 6/1/31 (48:21:0B:56:AE:44, moved to 2100 per the Review comment). Confirm with the AV team and move to 2700 if they are room NUCs</w:t>
+      </w:r>
+    </w:p>
+    <w:p>
+      <w:pPr>
+        <w:pStyle w:val="ListParagraph"/>
+        <w:numPr>
+          <w:ilvl w:val="0"/>
+          <w:numId w:val="1"/>
+        </w:numPr>
+        <w:spacing w:after="60"/>
+      </w:pPr>
+      <w:r>
+        <w:t xml:space="preserve">Other unlisted AV-side devices still on the old VLANs: LT2-1 1/1/9 (VMware MAC), lv4 4/1/19 (Airtame-type, 1272) and lv4 4/1/30 (F8:25:51, projector-type)</w:t>
       </w:r>
     </w:p>
     <w:p>

</xml_diff>

<commit_message>
Record the 13 outlets moved to 2100 on 10 Oct
Workbook ports marked moved, Switches results, Review item for the three
outlets where the patching sheet and device list disagree; config file
status line; change document Review tab changes and open items.

Co-Authored-By: Claude Opus 5.5 <noreply@anthropic.com>
Claude-Session: https://claude.ai/code/session_01BZ7jJsE6GWKm6ehHY39VNr
</commit_message>
<xml_diff>
--- a/Trinity 200V VLAN Migration.docx
+++ b/Trinity 200V VLAN Migration.docx
@@ -3584,6 +3584,11 @@
       </w:r>
     </w:p>
     <w:p>
+      <w:r>
+        <w:t xml:space="preserve">On 10 October 2026, 13 outlets with devices 20:7B:D2:30:xx:xx were moved from VLAN 1230 to VLAN 2100 (staff wired) using 200V-207bd2-2100-ICX.txt. The ports were found from the outlet labels in the Dycom patching sheet (Switch Physical Patching, 30 July 2025): lv3 2/1/17, 4/1/43, 5/1/11, 5/1/23, 5/1/29, 5/1/40 and 5/1/47; lv4 1/1/15, 1/1/21, 1/1/30, 1/1/34, 4/1/4 and 4/1/26. All were untagged on 1230 with no device in the device list. The change was applied and saved on both switches; the devices were not tested.</w:t>
+      </w:r>
+    </w:p>
+    <w:p>
       <w:pPr>
         <w:keepNext/>
         <w:spacing w:before="240" w:after="120"/>
@@ -3737,6 +3742,19 @@
       </w:pPr>
       <w:r>
         <w:t xml:space="preserve">Room NUC-type devices not on 2700: LT2-1 1/1/21 (CLA-TAN3130059J, still on 1240) and lv6 6/1/31 (48:21:0B:56:AE:44, moved to 2100 per the Review comment). Confirm with the AV team and move to 2700 if they are room NUCs</w:t>
+      </w:r>
+    </w:p>
+    <w:p>
+      <w:pPr>
+        <w:pStyle w:val="ListParagraph"/>
+        <w:numPr>
+          <w:ilvl w:val="0"/>
+          <w:numId w:val="1"/>
+        </w:numPr>
+        <w:spacing w:after="60"/>
+      </w:pPr>
+      <w:r>
+        <w:t xml:space="preserve">Outlets 200V3J14 (lv3 2/1/26), 200V4I17 (lv4 1/1/24) and 200V4H9 (lv4 2/1/24): the patching sheet puts 20:7B:D2:30 devices there, but the device list has a Touch Panel and two Airtames. The ports are on 2700. Confirm on site and move to 2100 if the 20:7B:D2:30 devices are there</w:t>
       </w:r>
     </w:p>
     <w:p>

</xml_diff>

<commit_message>
Change document: CPX access finding, projector screen, pilot AP flapping
Co-Authored-By: Claude Opus 5.5 <noreply@anthropic.com>
Claude-Session: https://claude.ai/code/session_01BZ7jJsE6GWKm6ehHY39VNr
</commit_message>
<xml_diff>
--- a/Trinity 200V VLAN Migration.docx
+++ b/Trinity 200V VLAN Migration.docx
@@ -3165,7 +3165,7 @@
         <w:spacing w:after="60"/>
       </w:pPr>
       <w:r>
-        <w:t xml:space="preserve">Unplanned change on trinity200V-core: APs moved to VLAN 2010 kept dropping off SmartZone because the WIFIMGMT-IN ACL denied the SmartZone private node addresses. Two entries were added: sequence 23 permit ip 10.21.1.0 0.0.0.255 host 192.168.81.100 and sequence 24 permit ip 10.21.1.0 0.0.0.255 host 192.168.245.100. The APs were stable afterwards</w:t>
+        <w:t xml:space="preserve">Unplanned change on trinity200V-core: APs moved to VLAN 2010 kept dropping off SmartZone because the WIFIMGMT-IN ACL denied the SmartZone private node addresses. Two entries were added: sequence 23 permit ip 10.21.1.0 0.0.0.255 host 192.168.81.100 and sequence 24 permit ip 10.21.1.0 0.0.0.255 host 192.168.245.100. The APs were stable afterwards. The two pilot APs (r650-3d-98-40 on lv3 1/1/6 and r650-39-4b-f0 on lv6 1/1/19) had been on VLAN 2010 since 5 October and were flapping in SmartZone for the same reason; the same entries fixed them</w:t>
       </w:r>
     </w:p>
     <w:p>
@@ -3598,7 +3598,72 @@
           <w:b/>
           <w:bCs/>
         </w:rPr>
+        <w:t xml:space="preserve">Issues raised after the cutover (10 October 2026)</w:t>
+      </w:r>
+    </w:p>
+    <w:p>
+      <w:pPr>
+        <w:pStyle w:val="ListParagraph"/>
+        <w:numPr>
+          <w:ilvl w:val="0"/>
+          <w:numId w:val="1"/>
+        </w:numPr>
+        <w:spacing w:after="60"/>
+      </w:pPr>
+      <w:r>
+        <w:t xml:space="preserve">Symphony CPX could not reach 200V AV devices on TCP 80 and 443 (tested to 10.21.37.14), while ping worked and the Mystro VC4 server connected. A packet capture on the CPX server showed it sends from 10.128.1.4, not 10.128.128.4, with SYNs going out and no reply. AV-IN on VLAN 2700 permits 10.128.128.0/24 (sequence 20) but denies other 10.0.0.0/8 destinations (sequence 30), so the AV devices' replies to 10.128.1.4 are dropped at the 200V core (ping works because sequence 23 permits echo-replies to any). Fix: AV-IN sequence 24 permit ip 10.21.36.0 0.0.1.255 host 10.128.1.4. ACL accounting on this build counts per ACL, not per entry, so it could not isolate the traffic</w:t>
+      </w:r>
+    </w:p>
+    <w:p>
+      <w:pPr>
+        <w:pStyle w:val="ListParagraph"/>
+        <w:numPr>
+          <w:ilvl w:val="0"/>
+          <w:numId w:val="1"/>
+        </w:numPr>
+        <w:spacing w:after="60"/>
+      </w:pPr>
+      <w:r>
+        <w:t xml:space="preserve">Projector Screen 04:91:62:D7:90:01 (outlet 200V2K08, lv6 4/1/5, new address 10.21.37.43) was moved to VLAN 2700 in the cutover. The AV team is power cycling it so it requests an address on 2700. If it has a fixed address (old 10.16.12.135) it needs setting to DHCP or to 10.21.37.43/23, gateway 10.21.36.1</w:t>
+      </w:r>
+    </w:p>
+    <w:p>
+      <w:pPr>
+        <w:keepNext/>
+        <w:spacing w:before="240" w:after="120"/>
+      </w:pPr>
+      <w:r>
+        <w:rPr>
+          <w:b/>
+          <w:bCs/>
+        </w:rPr>
         <w:t xml:space="preserve">Open items</w:t>
+      </w:r>
+    </w:p>
+    <w:p>
+      <w:pPr>
+        <w:pStyle w:val="ListParagraph"/>
+        <w:numPr>
+          <w:ilvl w:val="0"/>
+          <w:numId w:val="1"/>
+        </w:numPr>
+        <w:spacing w:after="60"/>
+      </w:pPr>
+      <w:r>
+        <w:t xml:space="preserve">Apply AV-IN sequence 24 for the CPX server (10.128.1.4) if not yet done, write memory, and have Symphony retest TCP 80/443. Decide whether all of 10.128.1.0/24 should be permitted on the new VLANs' ACLs, as only 10.128.128.0/24 is permitted today</w:t>
+      </w:r>
+    </w:p>
+    <w:p>
+      <w:pPr>
+        <w:pStyle w:val="ListParagraph"/>
+        <w:numPr>
+          <w:ilvl w:val="0"/>
+          <w:numId w:val="1"/>
+        </w:numPr>
+        <w:spacing w:after="60"/>
+      </w:pPr>
+      <w:r>
+        <w:t xml:space="preserve">Projector Screen on lv6 4/1/5: after the AV team's power cycle, confirm 0491.62d7.9001 on VLAN 2700 and that 10.21.37.43 answers</w:t>
       </w:r>
     </w:p>
     <w:p>

</xml_diff>

<commit_message>
Record 10 Oct moves: lv4 4/1/30 and 4/1/19 to 2700, lv3 3/1/20 and lv4 3/1/1 to 2100
Co-Authored-By: Claude Opus 5.5 <noreply@anthropic.com>
Claude-Session: https://claude.ai/code/session_01BZ7jJsE6GWKm6ehHY39VNr
</commit_message>
<xml_diff>
--- a/Trinity 200V VLAN Migration.docx
+++ b/Trinity 200V VLAN Migration.docx
@@ -3589,6 +3589,11 @@
       </w:r>
     </w:p>
     <w:p>
+      <w:r>
+        <w:t xml:space="preserve">Also on 10 October 2026, after reviewing show interfaces brief on lv3, lv4 and lv6 (Old VLAN ports tab of the spreadsheet): lv4 4/1/30 (F8:25:51:CC:2C:76, Review item 49) and lv4 4/1/19 (Airtame 384b.76e0.b0b1, Review item 48) were moved to VLAN 2700, and two live staff PCs, lv3 3/1/20 (1c1a.dfc2.5143) and lv4 3/1/1 (1c1a.dfc2.4cc3), were moved from 1240 to 2100. That review found no device from the device list still on an old VLAN; 237 ports with no listed device remain on old VLANs, almost all with no link.</w:t>
+      </w:r>
+    </w:p>
+    <w:p>
       <w:pPr>
         <w:keepNext/>
         <w:spacing w:before="240" w:after="120"/>
@@ -3832,7 +3837,20 @@
         <w:spacing w:after="60"/>
       </w:pPr>
       <w:r>
-        <w:t xml:space="preserve">Other unlisted AV-side devices still on the old VLANs: LT2-1 1/1/9 (VMware MAC), lv4 4/1/19 (Airtame-type, 1272) and lv4 4/1/30 (F8:25:51, projector-type)</w:t>
+        <w:t xml:space="preserve">Other unlisted AV-side device still on an old VLAN: LT2-1 1/1/9 (VMware MAC, 1230)</w:t>
+      </w:r>
+    </w:p>
+    <w:p>
+      <w:pPr>
+        <w:pStyle w:val="ListParagraph"/>
+        <w:numPr>
+          <w:ilvl w:val="0"/>
+          <w:numId w:val="1"/>
+        </w:numPr>
+        <w:spacing w:after="60"/>
+      </w:pPr>
+      <w:r>
+        <w:t xml:space="preserve">Identify the remaining live devices on 1240 (lv3 3/1/10, 3/1/11, 3/1/13; lv4 3/1/4, 3/1/11, 3/1/39; lv6 1/1/32, 2/1/6, 5/1/5, 5/1/6, 5/1/10, 5/1/17, 5/1/19, 5/1/41, 5/1/44, 6/1/2) and decide whether to move them to 2100</w:t>
       </w:r>
     </w:p>
     <w:p>

</xml_diff>

<commit_message>
Record lv6 unit 3 failures, ring plan and SmartZone member-count issue
Co-Authored-By: Claude Opus 5.5 <noreply@anthropic.com>
Claude-Session: https://claude.ai/code/session_01BZ7jJsE6GWKm6ehHY39VNr
</commit_message>
<xml_diff>
--- a/Trinity 200V VLAN Migration.docx
+++ b/Trinity 200V VLAN Migration.docx
@@ -2936,7 +2936,7 @@
                 <w:sz w:val="20"/>
                 <w:szCs w:val="20"/>
               </w:rPr>
-              <w:t xml:space="preserve">Cutover done, 145 ports; spanning-tree enabled on 2600 and 2700. Units 3 and 4 left the stack during the cutover and were recovered by a reload; all 7 units Ready afterwards. Config saved</w:t>
+              <w:t xml:space="preserve">Cutover done, 145 ports; spanning-tree enabled on 2600 and 2700. Units 3 and 4 left the stack twice (20:03 and 22:44 on 9 October); see below. All 7 units Ready again from 13:35 on 10 October. Config saved</w:t>
             </w:r>
           </w:p>
         </w:tc>
@@ -3217,7 +3217,7 @@
         <w:spacing w:after="60"/>
       </w:pPr>
       <w:r>
-        <w:t xml:space="preserve">lv6: units 3 and 4 left the stack during the cutover. The stack was reloaded and all units rejoined; the ports were checked afterwards. lv6 is cabled as a chain rather than a ring</w:t>
+        <w:t xml:space="preserve">lv6: units 3 and 4 left the stack at 20:03 on 9 October during the cutover and rejoined at 20:44 after a restart. They left again at 22:44 the same night and stayed out until unit 3 was power cycled at 13:35 on 10 October (about 15 hours). See the lv6 stack section below</w:t>
       </w:r>
     </w:p>
     <w:p>
@@ -3629,7 +3629,313 @@
         <w:spacing w:after="60"/>
       </w:pPr>
       <w:r>
-        <w:t xml:space="preserve">Projector Screen 04:91:62:D7:90:01 (outlet 200V2K08, lv6 4/1/5, new address 10.21.37.43) was moved to VLAN 2700 in the cutover. The AV team is power cycling it so it requests an address on 2700. If it has a fixed address (old 10.16.12.135) it needs setting to DHCP or to 10.21.37.43/23, gateway 10.21.36.1</w:t>
+        <w:t xml:space="preserve">Projector Screen 04:91:62:D7:90:01 (outlet 200V2K08, lv6 4/1/5, new address 10.21.37.43) was moved to VLAN 2700 in the cutover but was not working on 10 October. Port 4/1/5 is on lv6 unit 4, which was out of the stack from 22:44 on 9 October to 13:35 on 10 October (see below), so the port had no link; the device itself was not the cause. If it is still not reachable after the stack recovery and it has a fixed address (old 10.16.12.135), it needs setting to DHCP or to 10.21.37.43/23, gateway 10.21.36.1</w:t>
+      </w:r>
+    </w:p>
+    <w:p>
+      <w:pPr>
+        <w:keepNext/>
+        <w:spacing w:before="240" w:after="120"/>
+      </w:pPr>
+      <w:r>
+        <w:rPr>
+          <w:b/>
+          <w:bCs/>
+        </w:rPr>
+        <w:t xml:space="preserve">lv6 stack: unit 3 failures</w:t>
+      </w:r>
+    </w:p>
+    <w:p>
+      <w:r>
+        <w:t xml:space="preserve">lv6 is a seven-unit ICX8200 stack cabled as a chain (4 - 3 - 2 - 1 - 5 - 6 - 7); unit 1 is active (priority 128) and unit 2 standby (110). Unit 4 reaches the stack only through unit 3, so when unit 3 drops, unit 4 drops with it.</w:t>
+      </w:r>
+    </w:p>
+    <w:p>
+      <w:pPr>
+        <w:spacing w:after="80"/>
+      </w:pPr>
+    </w:p>
+    <w:tbl>
+      <w:tblPr>
+        <w:tblW w:w="9026" w:type="dxa"/>
+        <w:tblBorders>
+          <w:top w:val="single" w:sz="4" w:space="0" w:color="A6A6A6"/>
+          <w:left w:val="single" w:sz="4" w:space="0" w:color="A6A6A6"/>
+          <w:bottom w:val="single" w:sz="4" w:space="0" w:color="A6A6A6"/>
+          <w:right w:val="single" w:sz="4" w:space="0" w:color="A6A6A6"/>
+          <w:insideH w:val="single" w:sz="4" w:space="0" w:color="A6A6A6"/>
+          <w:insideV w:val="single" w:sz="4" w:space="0" w:color="A6A6A6"/>
+        </w:tblBorders>
+        <w:tblLayout w:type="fixed"/>
+        <w:tblCellMar>
+          <w:top w:w="40" w:type="dxa"/>
+          <w:left w:w="80" w:type="dxa"/>
+          <w:bottom w:w="40" w:type="dxa"/>
+          <w:right w:w="80" w:type="dxa"/>
+        </w:tblCellMar>
+      </w:tblPr>
+      <w:tblGrid>
+        <w:gridCol w:w="3068"/>
+        <w:gridCol w:w="5958"/>
+      </w:tblGrid>
+      <w:tr>
+        <w:trPr>
+          <w:cantSplit/>
+          <w:tblHeader/>
+        </w:trPr>
+        <w:tc>
+          <w:tcPr>
+            <w:tcW w:w="3068" w:type="dxa"/>
+            <w:shd w:val="clear" w:color="auto" w:fill="D9D9D9"/>
+          </w:tcPr>
+          <w:p>
+            <w:pPr>
+              <w:spacing w:after="0" w:line="240" w:lineRule="auto"/>
+            </w:pPr>
+            <w:r>
+              <w:rPr>
+                <w:b/>
+                <w:bCs/>
+                <w:sz w:val="20"/>
+                <w:szCs w:val="20"/>
+              </w:rPr>
+              <w:t xml:space="preserve">Time</w:t>
+            </w:r>
+          </w:p>
+        </w:tc>
+        <w:tc>
+          <w:tcPr>
+            <w:tcW w:w="5958" w:type="dxa"/>
+            <w:shd w:val="clear" w:color="auto" w:fill="D9D9D9"/>
+          </w:tcPr>
+          <w:p>
+            <w:pPr>
+              <w:spacing w:after="0" w:line="240" w:lineRule="auto"/>
+            </w:pPr>
+            <w:r>
+              <w:rPr>
+                <w:b/>
+                <w:bCs/>
+                <w:sz w:val="20"/>
+                <w:szCs w:val="20"/>
+              </w:rPr>
+              <w:t xml:space="preserve">Event (from show logging and show stack)</w:t>
+            </w:r>
+          </w:p>
+        </w:tc>
+      </w:tr>
+      <w:tr>
+        <w:trPr>
+          <w:cantSplit/>
+        </w:trPr>
+        <w:tc>
+          <w:tcPr>
+            <w:tcW w:w="3068" w:type="dxa"/>
+          </w:tcPr>
+          <w:p>
+            <w:pPr>
+              <w:spacing w:after="0" w:line="240" w:lineRule="auto"/>
+            </w:pPr>
+            <w:r>
+              <w:rPr>
+                <w:sz w:val="20"/>
+                <w:szCs w:val="20"/>
+              </w:rPr>
+              <w:t xml:space="preserve">Fri 9 Oct 20:03</w:t>
+            </w:r>
+          </w:p>
+        </w:tc>
+        <w:tc>
+          <w:tcPr>
+            <w:tcW w:w="5958" w:type="dxa"/>
+          </w:tcPr>
+          <w:p>
+            <w:pPr>
+              <w:spacing w:after="0" w:line="240" w:lineRule="auto"/>
+            </w:pPr>
+            <w:r>
+              <w:rPr>
+                <w:sz w:val="20"/>
+                <w:szCs w:val="20"/>
+              </w:rPr>
+              <w:t xml:space="preserve">Units 3 and 4 deleted from the stack during the cutover</w:t>
+            </w:r>
+          </w:p>
+        </w:tc>
+      </w:tr>
+      <w:tr>
+        <w:trPr>
+          <w:cantSplit/>
+        </w:trPr>
+        <w:tc>
+          <w:tcPr>
+            <w:tcW w:w="3068" w:type="dxa"/>
+          </w:tcPr>
+          <w:p>
+            <w:pPr>
+              <w:spacing w:after="0" w:line="240" w:lineRule="auto"/>
+            </w:pPr>
+            <w:r>
+              <w:rPr>
+                <w:sz w:val="20"/>
+                <w:szCs w:val="20"/>
+              </w:rPr>
+              <w:t xml:space="preserve">Fri 9 Oct 20:44</w:t>
+            </w:r>
+          </w:p>
+        </w:tc>
+        <w:tc>
+          <w:tcPr>
+            <w:tcW w:w="5958" w:type="dxa"/>
+          </w:tcPr>
+          <w:p>
+            <w:pPr>
+              <w:spacing w:after="0" w:line="240" w:lineRule="auto"/>
+            </w:pPr>
+            <w:r>
+              <w:rPr>
+                <w:sz w:val="20"/>
+                <w:szCs w:val="20"/>
+              </w:rPr>
+              <w:t xml:space="preserve">Units 3 and 4 rejoined after a restart</w:t>
+            </w:r>
+          </w:p>
+        </w:tc>
+      </w:tr>
+      <w:tr>
+        <w:trPr>
+          <w:cantSplit/>
+        </w:trPr>
+        <w:tc>
+          <w:tcPr>
+            <w:tcW w:w="3068" w:type="dxa"/>
+          </w:tcPr>
+          <w:p>
+            <w:pPr>
+              <w:spacing w:after="0" w:line="240" w:lineRule="auto"/>
+            </w:pPr>
+            <w:r>
+              <w:rPr>
+                <w:sz w:val="20"/>
+                <w:szCs w:val="20"/>
+              </w:rPr>
+              <w:t xml:space="preserve">Fri 9 Oct 22:44:19</w:t>
+            </w:r>
+          </w:p>
+        </w:tc>
+        <w:tc>
+          <w:tcPr>
+            <w:tcW w:w="5958" w:type="dxa"/>
+          </w:tcPr>
+          <w:p>
+            <w:pPr>
+              <w:spacing w:after="0" w:line="240" w:lineRule="auto"/>
+            </w:pPr>
+            <w:r>
+              <w:rPr>
+                <w:sz w:val="20"/>
+                <w:szCs w:val="20"/>
+              </w:rPr>
+              <w:t xml:space="preserve">Units 3 and 4 deleted again in the same second. All their ports went down, including unit 3's stack ports (3/2/1, 3/2/3) and uplink LAG member 3/2/2. No stack-port flap, power or temperature message before it</w:t>
+            </w:r>
+          </w:p>
+        </w:tc>
+      </w:tr>
+      <w:tr>
+        <w:trPr>
+          <w:cantSplit/>
+        </w:trPr>
+        <w:tc>
+          <w:tcPr>
+            <w:tcW w:w="3068" w:type="dxa"/>
+          </w:tcPr>
+          <w:p>
+            <w:pPr>
+              <w:spacing w:after="0" w:line="240" w:lineRule="auto"/>
+            </w:pPr>
+            <w:r>
+              <w:rPr>
+                <w:sz w:val="20"/>
+                <w:szCs w:val="20"/>
+              </w:rPr>
+              <w:t xml:space="preserve">Sat 10 Oct 13:35</w:t>
+            </w:r>
+          </w:p>
+        </w:tc>
+        <w:tc>
+          <w:tcPr>
+            <w:tcW w:w="5958" w:type="dxa"/>
+          </w:tcPr>
+          <w:p>
+            <w:pPr>
+              <w:spacing w:after="0" w:line="240" w:lineRule="auto"/>
+            </w:pPr>
+            <w:r>
+              <w:rPr>
+                <w:sz w:val="20"/>
+                <w:szCs w:val="20"/>
+              </w:rPr>
+              <w:t xml:space="preserve">Unit 3 power cycled on site; units 3 and 4 rejoined. Unit 3 uptime then 5 minutes, unit 4 20 hours (unit 4 never restarted)</w:t>
+            </w:r>
+          </w:p>
+        </w:tc>
+      </w:tr>
+    </w:tbl>
+    <w:p>
+      <w:pPr>
+        <w:spacing w:after="80"/>
+      </w:pPr>
+    </w:p>
+    <w:p>
+      <w:pPr>
+        <w:pStyle w:val="ListParagraph"/>
+        <w:numPr>
+          <w:ilvl w:val="0"/>
+          <w:numId w:val="1"/>
+        </w:numPr>
+        <w:spacing w:after="60"/>
+      </w:pPr>
+      <w:r>
+        <w:t xml:space="preserve">Impact while out: all ports on units 3 and 4 had no link (AV on 3/1/11-48 and 4/1/4-23, building access on 4/1/24, staff ports) and lv6's uplink LAG ran on one 10G link (1/2/4) instead of two</w:t>
+      </w:r>
+    </w:p>
+    <w:p>
+      <w:pPr>
+        <w:pStyle w:val="ListParagraph"/>
+        <w:numPr>
+          <w:ilvl w:val="0"/>
+          <w:numId w:val="1"/>
+        </w:numPr>
+        <w:spacing w:after="60"/>
+      </w:pPr>
+      <w:r>
+        <w:t xml:space="preserve">Assessment: unit 3 (ICX8200-48PF2, serial FNM4319U09A, FastIron 10.0.10g_cd3) hangs without warning and only recovers with a restart. This points to the unit itself rather than the stack cable</w:t>
+      </w:r>
+    </w:p>
+    <w:p>
+      <w:pPr>
+        <w:pStyle w:val="ListParagraph"/>
+        <w:numPr>
+          <w:ilvl w:val="0"/>
+          <w:numId w:val="1"/>
+        </w:numPr>
+        <w:spacing w:after="60"/>
+      </w:pPr>
+      <w:r>
+        <w:t xml:space="preserve">SmartZone shows the lv6 switch online but with 5 stack members, not 7, after units 3 and 4 rejoined. A manager session reset (manager disable / no manager disable) did not refresh it. The switch itself shows all 7 units Ready; this is a SmartZone display issue only</w:t>
+      </w:r>
+    </w:p>
+    <w:p>
+      <w:pPr>
+        <w:pStyle w:val="ListParagraph"/>
+        <w:numPr>
+          <w:ilvl w:val="0"/>
+          <w:numId w:val="1"/>
+        </w:numPr>
+        <w:spacing w:after="60"/>
+      </w:pPr>
+      <w:r>
+        <w:t xml:space="preserve">Unit IDs and priorities stay as they are: active and standby (units 1 and 2) are correct, and renumbering would change every port name used in the configuration and records</w:t>
       </w:r>
     </w:p>
     <w:p>
@@ -3863,7 +4169,46 @@
         <w:spacing w:after="60"/>
       </w:pPr>
       <w:r>
-        <w:t xml:space="preserve">Later window: add the closing stack cable on lv6 and lv4, and lower the spanning-tree priority on trinity200V-core (switch-200V-8 is currently root)</w:t>
+        <w:t xml:space="preserve">lv6 (urgent): close the stack into a ring between unit 4 and unit 7. Configure 4/2/3 and 7/2/3 as stack ports (stack unit 4: stack-port 4/2/1 4/2/3; stack unit 7: stack-port 7/2/1 7/2/3), then cable 4/2/3 to 7/2/3, outside business hours. Unit 4 then stays up if unit 3 fails again</w:t>
+      </w:r>
+    </w:p>
+    <w:p>
+      <w:pPr>
+        <w:pStyle w:val="ListParagraph"/>
+        <w:numPr>
+          <w:ilvl w:val="0"/>
+          <w:numId w:val="1"/>
+        </w:numPr>
+        <w:spacing w:after="60"/>
+      </w:pPr>
+      <w:r>
+        <w:t xml:space="preserve">lv6: open a Ruckus TAC case for unit 3 (FNM4319U09A) with show logging, show tech-support and show version, and ask for an RMA. Include the SmartZone 5-member display issue</w:t>
+      </w:r>
+    </w:p>
+    <w:p>
+      <w:pPr>
+        <w:pStyle w:val="ListParagraph"/>
+        <w:numPr>
+          <w:ilvl w:val="0"/>
+          <w:numId w:val="1"/>
+        </w:numPr>
+        <w:spacing w:after="60"/>
+      </w:pPr>
+      <w:r>
+        <w:t xml:space="preserve">lv6: until unit 3 is replaced, check show stack on the switch (not SmartZone) at each check; if units 3 and 4 are missing, power cycle unit 3. Reseat or replace the unit 2 to unit 3 stack cable (2/2/3 to 3/2/1) while on site</w:t>
+      </w:r>
+    </w:p>
+    <w:p>
+      <w:pPr>
+        <w:pStyle w:val="ListParagraph"/>
+        <w:numPr>
+          <w:ilvl w:val="0"/>
+          <w:numId w:val="1"/>
+        </w:numPr>
+        <w:spacing w:after="60"/>
+      </w:pPr>
+      <w:r>
+        <w:t xml:space="preserve">Later window: close the lv4 stack into a ring, and lower the spanning-tree priority on trinity200V-core (switch-200V-8 is currently root)</w:t>
       </w:r>
     </w:p>
     <w:p>

</xml_diff>